<commit_message>
test: Phase 5 test verification — all 43 cases pass + updated Departments documentation
</commit_message>
<xml_diff>
--- a/Departments-Module-Documentation.docx
+++ b/Departments-Module-Documentation.docx
@@ -18,7 +18,7 @@
         <w:jc w:val="center"/>
       </w:pPr>
       <w:r>
-        <w:t>July 1, 2026</w:t>
+        <w:t>July 2, 2026</w:t>
       </w:r>
     </w:p>
     <w:p/>
@@ -32,12 +32,66 @@
     </w:p>
     <w:p>
       <w:r>
-        <w:t>The Departments Module manages the organizational structure of the company, including departments, their hierarchy (parent-child relationships via self-referential foreign keys), and department-level data scoping. Departments represent internal organizational units and are used to filter dashboards, user memberships, VA assignments, and client relationships by department context.</w:t>
+        <w:t>The Departments Module manages the organizational structure of the company, including departments, their hierarchy (parent-child relationships), and classification into Levels. Departments may represent internal organizational units (Executive, Management) or client-facing services (Service) where Virtual Assistants (VAs) are assigned to clients.</w:t>
+      </w:r>
+    </w:p>
+    <w:p>
+      <w:pPr>
+        <w:pStyle w:val="Heading1"/>
+      </w:pPr>
+      <w:r>
+        <w:t>HIERARCHY STRUCTURE</w:t>
       </w:r>
     </w:p>
     <w:p>
       <w:r>
-        <w:t>Departments are managed via the Admin Panel (/admin) where Super Admins and System Admins can create, edit, rename, toggle active/inactive status, and manage user memberships. The /departments page provides a directory view for navigating between department-scoped dashboards.</w:t>
+        <w:t>The module supports a three-Level hierarchy. Each Level is a system-protected record that cannot be deleted or have its Level field changed.</w:t>
+      </w:r>
+    </w:p>
+    <w:p>
+      <w:r>
+        <w:t>Current seeded hierarchy:</w:t>
+      </w:r>
+    </w:p>
+    <w:p>
+      <w:r>
+        <w:t>Executive (Level)</w:t>
+        <w:br/>
+        <w:t>└ (reserved for future executive departments)</w:t>
+        <w:br/>
+        <w:br/>
+        <w:t>Management (Level)</w:t>
+        <w:br/>
+        <w:t>└ Staff Department</w:t>
+        <w:br/>
+        <w:t xml:space="preserve">    └ Customer Success [CS]</w:t>
+        <w:br/>
+        <w:t xml:space="preserve">    └ Human Resources [HR]</w:t>
+        <w:br/>
+        <w:t xml:space="preserve">    └ Software Development [DEV]</w:t>
+        <w:br/>
+        <w:t xml:space="preserve">    └ Business Operations [BIZOPS]</w:t>
+        <w:br/>
+        <w:t xml:space="preserve">    └ Admin Department [ADMIN]</w:t>
+        <w:br/>
+        <w:br/>
+        <w:t>Service (Level)</w:t>
+        <w:br/>
+        <w:t>└ VA Management [VAMGT]</w:t>
+        <w:br/>
+        <w:t xml:space="preserve">    └ Amazon Department [AMZ]</w:t>
+        <w:br/>
+        <w:t xml:space="preserve">    └ Wholesale Department [WS]</w:t>
+        <w:br/>
+        <w:t xml:space="preserve">    └ PPC Department [PPC]</w:t>
+        <w:br/>
+        <w:t xml:space="preserve">    └ Social Media Department [SM]</w:t>
+        <w:br/>
+        <w:t xml:space="preserve">    └ Executive Assistant Department [EA]</w:t>
+        <w:br/>
+        <w:t xml:space="preserve">    └ Walmart Department [WM]</w:t>
+        <w:br/>
+        <w:t xml:space="preserve">    └ Creatives Department [CRTV]</w:t>
       </w:r>
     </w:p>
     <w:p>
@@ -156,7 +210,7 @@
           </w:tcPr>
           <w:p>
             <w:r>
-              <w:t>Text (String)</w:t>
+              <w:t>Text</w:t>
             </w:r>
           </w:p>
         </w:tc>
@@ -228,7 +282,7 @@
           </w:tcPr>
           <w:p>
             <w:r>
-              <w:t>No</w:t>
+              <w:t>-</w:t>
             </w:r>
           </w:p>
         </w:tc>
@@ -250,7 +304,7 @@
           </w:tcPr>
           <w:p>
             <w:r>
-              <w:t>Description</w:t>
+              <w:t>Short Name</w:t>
             </w:r>
           </w:p>
         </w:tc>
@@ -260,7 +314,7 @@
           </w:tcPr>
           <w:p>
             <w:r>
-              <w:t>Text (String)</w:t>
+              <w:t>Text</w:t>
             </w:r>
           </w:p>
         </w:tc>
@@ -302,7 +356,7 @@
           </w:tcPr>
           <w:p>
             <w:r>
-              <w:t>Department Head</w:t>
+              <w:t>Acronym</w:t>
             </w:r>
           </w:p>
         </w:tc>
@@ -312,7 +366,7 @@
           </w:tcPr>
           <w:p>
             <w:r>
-              <w:t>Lookup (User)</w:t>
+              <w:t>Text (2-6 uppercase letters)</w:t>
             </w:r>
           </w:p>
         </w:tc>
@@ -322,7 +376,7 @@
           </w:tcPr>
           <w:p>
             <w:r>
-              <w:t>No</w:t>
+              <w:t>Yes</w:t>
             </w:r>
           </w:p>
         </w:tc>
@@ -332,7 +386,7 @@
           </w:tcPr>
           <w:p>
             <w:r>
-              <w:t>No</w:t>
+              <w:t>Yes</w:t>
             </w:r>
           </w:p>
         </w:tc>
@@ -354,7 +408,7 @@
           </w:tcPr>
           <w:p>
             <w:r>
-              <w:t>Is Parent Department</w:t>
+              <w:t>Level</w:t>
             </w:r>
           </w:p>
         </w:tc>
@@ -364,7 +418,267 @@
           </w:tcPr>
           <w:p>
             <w:r>
-              <w:t>Boolean</w:t>
+              <w:t>Enum (Executive / Management / Service)</w:t>
+            </w:r>
+          </w:p>
+        </w:tc>
+        <w:tc>
+          <w:tcPr>
+            <w:tcW w:type="dxa" w:w="1728"/>
+          </w:tcPr>
+          <w:p>
+            <w:r>
+              <w:t>Yes</w:t>
+            </w:r>
+          </w:p>
+        </w:tc>
+        <w:tc>
+          <w:tcPr>
+            <w:tcW w:type="dxa" w:w="1728"/>
+          </w:tcPr>
+          <w:p>
+            <w:r>
+              <w:t>-</w:t>
+            </w:r>
+          </w:p>
+        </w:tc>
+      </w:tr>
+      <w:tr>
+        <w:tc>
+          <w:tcPr>
+            <w:tcW w:type="dxa" w:w="1728"/>
+          </w:tcPr>
+          <w:p>
+            <w:r>
+              <w:t>6</w:t>
+            </w:r>
+          </w:p>
+        </w:tc>
+        <w:tc>
+          <w:tcPr>
+            <w:tcW w:type="dxa" w:w="1728"/>
+          </w:tcPr>
+          <w:p>
+            <w:r>
+              <w:t>Status</w:t>
+            </w:r>
+          </w:p>
+        </w:tc>
+        <w:tc>
+          <w:tcPr>
+            <w:tcW w:type="dxa" w:w="1728"/>
+          </w:tcPr>
+          <w:p>
+            <w:r>
+              <w:t>Enum (Active / Merged / Split / Inactive)</w:t>
+            </w:r>
+          </w:p>
+        </w:tc>
+        <w:tc>
+          <w:tcPr>
+            <w:tcW w:type="dxa" w:w="1728"/>
+          </w:tcPr>
+          <w:p>
+            <w:r>
+              <w:t>Yes (system)</w:t>
+            </w:r>
+          </w:p>
+        </w:tc>
+        <w:tc>
+          <w:tcPr>
+            <w:tcW w:type="dxa" w:w="1728"/>
+          </w:tcPr>
+          <w:p>
+            <w:r>
+              <w:t>-</w:t>
+            </w:r>
+          </w:p>
+        </w:tc>
+      </w:tr>
+      <w:tr>
+        <w:tc>
+          <w:tcPr>
+            <w:tcW w:type="dxa" w:w="1728"/>
+          </w:tcPr>
+          <w:p>
+            <w:r>
+              <w:t>7</w:t>
+            </w:r>
+          </w:p>
+        </w:tc>
+        <w:tc>
+          <w:tcPr>
+            <w:tcW w:type="dxa" w:w="1728"/>
+          </w:tcPr>
+          <w:p>
+            <w:r>
+              <w:t>Merged Into</w:t>
+            </w:r>
+          </w:p>
+        </w:tc>
+        <w:tc>
+          <w:tcPr>
+            <w:tcW w:type="dxa" w:w="1728"/>
+          </w:tcPr>
+          <w:p>
+            <w:r>
+              <w:t>Lookup (Department)</w:t>
+            </w:r>
+          </w:p>
+        </w:tc>
+        <w:tc>
+          <w:tcPr>
+            <w:tcW w:type="dxa" w:w="1728"/>
+          </w:tcPr>
+          <w:p>
+            <w:r>
+              <w:t>Conditional</w:t>
+            </w:r>
+          </w:p>
+        </w:tc>
+        <w:tc>
+          <w:tcPr>
+            <w:tcW w:type="dxa" w:w="1728"/>
+          </w:tcPr>
+          <w:p>
+            <w:r>
+              <w:t>-</w:t>
+            </w:r>
+          </w:p>
+        </w:tc>
+      </w:tr>
+      <w:tr>
+        <w:tc>
+          <w:tcPr>
+            <w:tcW w:type="dxa" w:w="1728"/>
+          </w:tcPr>
+          <w:p>
+            <w:r>
+              <w:t>8</w:t>
+            </w:r>
+          </w:p>
+        </w:tc>
+        <w:tc>
+          <w:tcPr>
+            <w:tcW w:type="dxa" w:w="1728"/>
+          </w:tcPr>
+          <w:p>
+            <w:r>
+              <w:t>Split From</w:t>
+            </w:r>
+          </w:p>
+        </w:tc>
+        <w:tc>
+          <w:tcPr>
+            <w:tcW w:type="dxa" w:w="1728"/>
+          </w:tcPr>
+          <w:p>
+            <w:r>
+              <w:t>Lookup (Department)</w:t>
+            </w:r>
+          </w:p>
+        </w:tc>
+        <w:tc>
+          <w:tcPr>
+            <w:tcW w:type="dxa" w:w="1728"/>
+          </w:tcPr>
+          <w:p>
+            <w:r>
+              <w:t>Conditional</w:t>
+            </w:r>
+          </w:p>
+        </w:tc>
+        <w:tc>
+          <w:tcPr>
+            <w:tcW w:type="dxa" w:w="1728"/>
+          </w:tcPr>
+          <w:p>
+            <w:r>
+              <w:t>-</w:t>
+            </w:r>
+          </w:p>
+        </w:tc>
+      </w:tr>
+      <w:tr>
+        <w:tc>
+          <w:tcPr>
+            <w:tcW w:type="dxa" w:w="1728"/>
+          </w:tcPr>
+          <w:p>
+            <w:r>
+              <w:t>9</w:t>
+            </w:r>
+          </w:p>
+        </w:tc>
+        <w:tc>
+          <w:tcPr>
+            <w:tcW w:type="dxa" w:w="1728"/>
+          </w:tcPr>
+          <w:p>
+            <w:r>
+              <w:t>Description</w:t>
+            </w:r>
+          </w:p>
+        </w:tc>
+        <w:tc>
+          <w:tcPr>
+            <w:tcW w:type="dxa" w:w="1728"/>
+          </w:tcPr>
+          <w:p>
+            <w:r>
+              <w:t>Text</w:t>
+            </w:r>
+          </w:p>
+        </w:tc>
+        <w:tc>
+          <w:tcPr>
+            <w:tcW w:type="dxa" w:w="1728"/>
+          </w:tcPr>
+          <w:p>
+            <w:r>
+              <w:t>No</w:t>
+            </w:r>
+          </w:p>
+        </w:tc>
+        <w:tc>
+          <w:tcPr>
+            <w:tcW w:type="dxa" w:w="1728"/>
+          </w:tcPr>
+          <w:p>
+            <w:r>
+              <w:t>-</w:t>
+            </w:r>
+          </w:p>
+        </w:tc>
+      </w:tr>
+      <w:tr>
+        <w:tc>
+          <w:tcPr>
+            <w:tcW w:type="dxa" w:w="1728"/>
+          </w:tcPr>
+          <w:p>
+            <w:r>
+              <w:t>10</w:t>
+            </w:r>
+          </w:p>
+        </w:tc>
+        <w:tc>
+          <w:tcPr>
+            <w:tcW w:type="dxa" w:w="1728"/>
+          </w:tcPr>
+          <w:p>
+            <w:r>
+              <w:t>Date Created</w:t>
+            </w:r>
+          </w:p>
+        </w:tc>
+        <w:tc>
+          <w:tcPr>
+            <w:tcW w:type="dxa" w:w="1728"/>
+          </w:tcPr>
+          <w:p>
+            <w:r>
+              <w:t>Timestamp (auto)</w:t>
             </w:r>
           </w:p>
         </w:tc>
@@ -396,111 +710,7 @@
           </w:tcPr>
           <w:p>
             <w:r>
-              <w:t>6</w:t>
-            </w:r>
-          </w:p>
-        </w:tc>
-        <w:tc>
-          <w:tcPr>
-            <w:tcW w:type="dxa" w:w="1728"/>
-          </w:tcPr>
-          <w:p>
-            <w:r>
-              <w:t>Sort Order</w:t>
-            </w:r>
-          </w:p>
-        </w:tc>
-        <w:tc>
-          <w:tcPr>
-            <w:tcW w:type="dxa" w:w="1728"/>
-          </w:tcPr>
-          <w:p>
-            <w:r>
-              <w:t>Integer</w:t>
-            </w:r>
-          </w:p>
-        </w:tc>
-        <w:tc>
-          <w:tcPr>
-            <w:tcW w:type="dxa" w:w="1728"/>
-          </w:tcPr>
-          <w:p>
-            <w:r>
-              <w:t>Yes (auto)</w:t>
-            </w:r>
-          </w:p>
-        </w:tc>
-        <w:tc>
-          <w:tcPr>
-            <w:tcW w:type="dxa" w:w="1728"/>
-          </w:tcPr>
-          <w:p>
-            <w:r>
-              <w:t>No</w:t>
-            </w:r>
-          </w:p>
-        </w:tc>
-      </w:tr>
-      <w:tr>
-        <w:tc>
-          <w:tcPr>
-            <w:tcW w:type="dxa" w:w="1728"/>
-          </w:tcPr>
-          <w:p>
-            <w:r>
-              <w:t>7</w:t>
-            </w:r>
-          </w:p>
-        </w:tc>
-        <w:tc>
-          <w:tcPr>
-            <w:tcW w:type="dxa" w:w="1728"/>
-          </w:tcPr>
-          <w:p>
-            <w:r>
-              <w:t>Date Created</w:t>
-            </w:r>
-          </w:p>
-        </w:tc>
-        <w:tc>
-          <w:tcPr>
-            <w:tcW w:type="dxa" w:w="1728"/>
-          </w:tcPr>
-          <w:p>
-            <w:r>
-              <w:t>DateTime (auto)</w:t>
-            </w:r>
-          </w:p>
-        </w:tc>
-        <w:tc>
-          <w:tcPr>
-            <w:tcW w:type="dxa" w:w="1728"/>
-          </w:tcPr>
-          <w:p>
-            <w:r>
-              <w:t>Yes (auto)</w:t>
-            </w:r>
-          </w:p>
-        </w:tc>
-        <w:tc>
-          <w:tcPr>
-            <w:tcW w:type="dxa" w:w="1728"/>
-          </w:tcPr>
-          <w:p>
-            <w:r>
-              <w:t>No</w:t>
-            </w:r>
-          </w:p>
-        </w:tc>
-      </w:tr>
-      <w:tr>
-        <w:tc>
-          <w:tcPr>
-            <w:tcW w:type="dxa" w:w="1728"/>
-          </w:tcPr>
-          <w:p>
-            <w:r>
-              <w:t>8</w:t>
+              <w:t>11</w:t>
             </w:r>
           </w:p>
         </w:tc>
@@ -520,59 +730,7 @@
           </w:tcPr>
           <w:p>
             <w:r>
-              <w:t>DateTime (auto)</w:t>
-            </w:r>
-          </w:p>
-        </w:tc>
-        <w:tc>
-          <w:tcPr>
-            <w:tcW w:type="dxa" w:w="1728"/>
-          </w:tcPr>
-          <w:p>
-            <w:r>
-              <w:t>Yes (auto)</w:t>
-            </w:r>
-          </w:p>
-        </w:tc>
-        <w:tc>
-          <w:tcPr>
-            <w:tcW w:type="dxa" w:w="1728"/>
-          </w:tcPr>
-          <w:p>
-            <w:r>
-              <w:t>No</w:t>
-            </w:r>
-          </w:p>
-        </w:tc>
-      </w:tr>
-      <w:tr>
-        <w:tc>
-          <w:tcPr>
-            <w:tcW w:type="dxa" w:w="1728"/>
-          </w:tcPr>
-          <w:p>
-            <w:r>
-              <w:t>9</w:t>
-            </w:r>
-          </w:p>
-        </w:tc>
-        <w:tc>
-          <w:tcPr>
-            <w:tcW w:type="dxa" w:w="1728"/>
-          </w:tcPr>
-          <w:p>
-            <w:r>
-              <w:t>Active Status</w:t>
-            </w:r>
-          </w:p>
-        </w:tc>
-        <w:tc>
-          <w:tcPr>
-            <w:tcW w:type="dxa" w:w="1728"/>
-          </w:tcPr>
-          <w:p>
-            <w:r>
-              <w:t>Boolean</w:t>
+              <w:t>Timestamp (auto)</w:t>
             </w:r>
           </w:p>
         </w:tc>
@@ -616,63 +774,7 @@
     </w:p>
     <w:p>
       <w:r>
-        <w:rPr>
-          <w:b/>
-        </w:rPr>
-        <w:t xml:space="preserve">Data Type: </w:t>
-      </w:r>
-      <w:r>
-        <w:t>Text (String), max length determined by database column (VARCHAR)</w:t>
-      </w:r>
-    </w:p>
-    <w:p>
-      <w:r>
-        <w:rPr>
-          <w:b/>
-        </w:rPr>
-        <w:t xml:space="preserve">Required: </w:t>
-      </w:r>
-      <w:r>
-        <w:t>Yes</w:t>
-      </w:r>
-    </w:p>
-    <w:p>
-      <w:r>
-        <w:rPr>
-          <w:b/>
-        </w:rPr>
-        <w:t xml:space="preserve">Unique: </w:t>
-      </w:r>
-      <w:r>
-        <w:t>Yes — enforced by @unique constraint on name column</w:t>
-      </w:r>
-    </w:p>
-    <w:p>
-      <w:r>
-        <w:rPr>
-          <w:b/>
-        </w:rPr>
-        <w:t xml:space="preserve">Validation Rules: </w:t>
-      </w:r>
-      <w:r>
-        <w:t>- Must not be empty</w:t>
-        <w:br/>
-        <w:t>- Must be unique across all departments (database-level unique index)</w:t>
-        <w:br/>
-        <w:t>- No leading/trailing whitespace (auto-trimmed in editDepartment action)</w:t>
-        <w:br/>
-        <w:t>- Accessed via Prisma: prisma.department.create({ data: { name } })</w:t>
-      </w:r>
-    </w:p>
-    <w:p>
-      <w:r>
-        <w:rPr>
-          <w:b/>
-        </w:rPr>
-        <w:t xml:space="preserve">Description: </w:t>
-      </w:r>
-      <w:r>
-        <w:t>Full, official name of the department. Displayed in department cards, admin overview, filter dropdowns, and the dashboard header.</w:t>
+        <w:t>Full official name of the department. Required. Must be unique across all departments. Auto-trims leading/trailing whitespace. Maximum 100 characters. Whitespace-only values are rejected.</w:t>
       </w:r>
     </w:p>
     <w:p>
@@ -680,90 +782,90 @@
         <w:pStyle w:val="Heading2"/>
       </w:pPr>
       <w:r>
-        <w:t>Parent Department (parentId)</w:t>
+        <w:t>Parent Department</w:t>
       </w:r>
     </w:p>
     <w:p>
       <w:r>
-        <w:rPr>
-          <w:b/>
-        </w:rPr>
-        <w:t xml:space="preserve">Data Type: </w:t>
+        <w:t>Optional reference to the parent department. Establishes the hierarchy. Can be blank only for Level records (Executive / Management / Service). Self-references and circular references are blocked.</w:t>
       </w:r>
+    </w:p>
+    <w:p>
+      <w:pPr>
+        <w:pStyle w:val="Heading2"/>
+      </w:pPr>
       <w:r>
-        <w:t>Foreign Key / Self-referential Lookup (references Department.id)</w:t>
+        <w:t>Short Name</w:t>
       </w:r>
     </w:p>
     <w:p>
       <w:r>
-        <w:rPr>
-          <w:b/>
-        </w:rPr>
-        <w:t xml:space="preserve">Required: </w:t>
+        <w:t>Optional shortened display name. Used in space-constrained UI elements. Maximum 50 characters. Whitespace-only is treated as null.</w:t>
       </w:r>
+    </w:p>
+    <w:p>
+      <w:pPr>
+        <w:pStyle w:val="Heading2"/>
+      </w:pPr>
       <w:r>
-        <w:t>No — NULL allowed for top-level/parent departments</w:t>
+        <w:t>Acronym</w:t>
       </w:r>
     </w:p>
     <w:p>
       <w:r>
-        <w:rPr>
-          <w:b/>
-        </w:rPr>
-        <w:t xml:space="preserve">Unique: </w:t>
+        <w:t>Short 2-6 character uppercase abbreviation. Required. Must be unique across departments. Letters only — no numbers or special characters. Auto-converted to uppercase on save. Used for tagging and quick reference.</w:t>
       </w:r>
+    </w:p>
+    <w:p>
+      <w:pPr>
+        <w:pStyle w:val="Heading2"/>
+      </w:pPr>
       <w:r>
-        <w:t>No</w:t>
+        <w:t>Level</w:t>
       </w:r>
     </w:p>
     <w:p>
       <w:r>
-        <w:rPr>
-          <w:b/>
-        </w:rPr>
-        <w:t xml:space="preserve">Relation: </w:t>
+        <w:t>Required. Must be one of: Executive, Management, Service. Level records (the three default ones) cannot have their Level field changed by anyone.</w:t>
       </w:r>
+    </w:p>
+    <w:p>
+      <w:pPr>
+        <w:pStyle w:val="Heading2"/>
+      </w:pPr>
       <w:r>
-        <w:t>DeptHierarchy — self-referential via parentId → id, onDelete: SetNull</w:t>
+        <w:t>Status</w:t>
       </w:r>
     </w:p>
     <w:p>
       <w:r>
-        <w:rPr>
-          <w:b/>
-        </w:rPr>
-        <w:t xml:space="preserve">Children Access: </w:t>
+        <w:t>System-managed. Defaults to Active on creation. Automatically set to Merged or Split when those operations occur. Can only be manually toggled to Inactive (or back to Active).</w:t>
       </w:r>
+    </w:p>
+    <w:p>
+      <w:pPr>
+        <w:pStyle w:val="Heading2"/>
+      </w:pPr>
       <w:r>
-        <w:t>Accessible via children[] relation (Department[])</w:t>
+        <w:t>Merged Into</w:t>
       </w:r>
     </w:p>
     <w:p>
       <w:r>
-        <w:rPr>
-          <w:b/>
-        </w:rPr>
-        <w:t xml:space="preserve">Validation Rules: </w:t>
+        <w:t>Set automatically when a department is merged into another. Identifies the resulting department. Cleared if a department is reactivated.</w:t>
       </w:r>
+    </w:p>
+    <w:p>
+      <w:pPr>
+        <w:pStyle w:val="Heading2"/>
+      </w:pPr>
       <w:r>
-        <w:t>- Must reference an existing Department record</w:t>
-        <w:br/>
-        <w:t>- A department cannot reference itself as parent</w:t>
-        <w:br/>
-        <w:t>- Circular references are prevented by database constraints</w:t>
-        <w:br/>
-        <w:t>- If parent is deleted, child department parentId is set to NULL</w:t>
+        <w:t>Split From</w:t>
       </w:r>
     </w:p>
     <w:p>
       <w:r>
-        <w:rPr>
-          <w:b/>
-        </w:rPr>
-        <w:t xml:space="preserve">Description: </w:t>
-      </w:r>
-      <w:r>
-        <w:t>Defines the department this record reports to, establishing the hierarchy tree. Used for org structure visualization.</w:t>
+        <w:t>Set automatically on departments created via a split operation. Identifies the source department that was split.</w:t>
       </w:r>
     </w:p>
     <w:p>
@@ -776,57 +878,7 @@
     </w:p>
     <w:p>
       <w:r>
-        <w:rPr>
-          <w:b/>
-        </w:rPr>
-        <w:t xml:space="preserve">Data Type: </w:t>
-      </w:r>
-      <w:r>
-        <w:t>Text (String, nullable)</w:t>
-      </w:r>
-    </w:p>
-    <w:p>
-      <w:r>
-        <w:rPr>
-          <w:b/>
-        </w:rPr>
-        <w:t xml:space="preserve">Required: </w:t>
-      </w:r>
-      <w:r>
-        <w:t>No</w:t>
-      </w:r>
-    </w:p>
-    <w:p>
-      <w:r>
-        <w:rPr>
-          <w:b/>
-        </w:rPr>
-        <w:t xml:space="preserve">Unique: </w:t>
-      </w:r>
-      <w:r>
-        <w:t>No</w:t>
-      </w:r>
-    </w:p>
-    <w:p>
-      <w:r>
-        <w:rPr>
-          <w:b/>
-        </w:rPr>
-        <w:t xml:space="preserve">Validation Rules: </w:t>
-      </w:r>
-      <w:r>
-        <w:t>- Optional free-text field; any value accepted</w:t>
-      </w:r>
-    </w:p>
-    <w:p>
-      <w:r>
-        <w:rPr>
-          <w:b/>
-        </w:rPr>
-        <w:t xml:space="preserve">Description: </w:t>
-      </w:r>
-      <w:r>
-        <w:t>Optional description of the department, displayed on department cards and the admin overview. Set via inline edit or when creating a department.</w:t>
+        <w:t>Optional free-text description of the department.</w:t>
       </w:r>
     </w:p>
     <w:p>
@@ -834,62 +886,12 @@
         <w:pStyle w:val="Heading2"/>
       </w:pPr>
       <w:r>
-        <w:t>Department Head (headId)</w:t>
+        <w:t>Date Created</w:t>
       </w:r>
     </w:p>
     <w:p>
       <w:r>
-        <w:rPr>
-          <w:b/>
-        </w:rPr>
-        <w:t xml:space="preserve">Data Type: </w:t>
-      </w:r>
-      <w:r>
-        <w:t>Foreign Key / Lookup (references User.id)</w:t>
-      </w:r>
-    </w:p>
-    <w:p>
-      <w:r>
-        <w:rPr>
-          <w:b/>
-        </w:rPr>
-        <w:t xml:space="preserve">Required: </w:t>
-      </w:r>
-      <w:r>
-        <w:t>No</w:t>
-      </w:r>
-    </w:p>
-    <w:p>
-      <w:r>
-        <w:rPr>
-          <w:b/>
-        </w:rPr>
-        <w:t xml:space="preserve">Unique: </w:t>
-      </w:r>
-      <w:r>
-        <w:t>No — multiple departments can share a head (not restricted)</w:t>
-      </w:r>
-    </w:p>
-    <w:p>
-      <w:r>
-        <w:rPr>
-          <w:b/>
-        </w:rPr>
-        <w:t xml:space="preserve">Relation: </w:t>
-      </w:r>
-      <w:r>
-        <w:t>DeptHead — joins to User model via headId, onDelete: SetNull</w:t>
-      </w:r>
-    </w:p>
-    <w:p>
-      <w:r>
-        <w:rPr>
-          <w:b/>
-        </w:rPr>
-        <w:t xml:space="preserve">Description: </w:t>
-      </w:r>
-      <w:r>
-        <w:t>Assigns a user as the department head. Currently a data field without automated permission implications — used for reporting and organizational reference.</w:t>
+        <w:t>System-generated timestamp. Set automatically on creation. Cannot be modified by users.</w:t>
       </w:r>
     </w:p>
     <w:p>
@@ -897,302 +899,12 @@
         <w:pStyle w:val="Heading2"/>
       </w:pPr>
       <w:r>
-        <w:t>Is Parent Department (isParent)</w:t>
+        <w:t>Date Updated</w:t>
       </w:r>
     </w:p>
     <w:p>
       <w:r>
-        <w:rPr>
-          <w:b/>
-        </w:rPr>
-        <w:t xml:space="preserve">Data Type: </w:t>
-      </w:r>
-      <w:r>
-        <w:t>Boolean (true/false)</w:t>
-      </w:r>
-    </w:p>
-    <w:p>
-      <w:r>
-        <w:rPr>
-          <w:b/>
-        </w:rPr>
-        <w:t xml:space="preserve">Required: </w:t>
-      </w:r>
-      <w:r>
-        <w:t>Yes — defaults to false on creation via createDepartmentInline</w:t>
-      </w:r>
-    </w:p>
-    <w:p>
-      <w:r>
-        <w:rPr>
-          <w:b/>
-        </w:rPr>
-        <w:t xml:space="preserve">Unique: </w:t>
-      </w:r>
-      <w:r>
-        <w:t>No</w:t>
-      </w:r>
-    </w:p>
-    <w:p>
-      <w:r>
-        <w:rPr>
-          <w:b/>
-        </w:rPr>
-        <w:t xml:space="preserve">Description: </w:t>
-      </w:r>
-      <w:r>
-        <w:t>Indicates whether this department is a top-level parent department. Set to true automatically when created via the inline form in /admin. Used by /departments page to separate "Main Departments" from "Sub-Departments &amp; Teams" in the UI (parentDepts vs childDepts filter).</w:t>
-      </w:r>
-    </w:p>
-    <w:p>
-      <w:pPr>
-        <w:pStyle w:val="Heading2"/>
-      </w:pPr>
-      <w:r>
-        <w:t>Sort Order (sortOrder)</w:t>
-      </w:r>
-    </w:p>
-    <w:p>
-      <w:r>
-        <w:rPr>
-          <w:b/>
-        </w:rPr>
-        <w:t xml:space="preserve">Data Type: </w:t>
-      </w:r>
-      <w:r>
-        <w:t>Integer</w:t>
-      </w:r>
-    </w:p>
-    <w:p>
-      <w:r>
-        <w:rPr>
-          <w:b/>
-        </w:rPr>
-        <w:t xml:space="preserve">Required: </w:t>
-      </w:r>
-      <w:r>
-        <w:t>Yes — defaults to 0 on creation</w:t>
-      </w:r>
-    </w:p>
-    <w:p>
-      <w:r>
-        <w:rPr>
-          <w:b/>
-        </w:rPr>
-        <w:t xml:space="preserve">Unique: </w:t>
-      </w:r>
-      <w:r>
-        <w:t>No</w:t>
-      </w:r>
-    </w:p>
-    <w:p>
-      <w:r>
-        <w:rPr>
-          <w:b/>
-        </w:rPr>
-        <w:t xml:space="preserve">Description: </w:t>
-      </w:r>
-      <w:r>
-        <w:t>Controls display ordering of departments in lists and dropdowns. Queried with orderBy: { sortOrder: 'asc' } across all department queries.</w:t>
-      </w:r>
-    </w:p>
-    <w:p>
-      <w:pPr>
-        <w:pStyle w:val="Heading2"/>
-      </w:pPr>
-      <w:r>
-        <w:t>Date Created (createdAt)</w:t>
-      </w:r>
-    </w:p>
-    <w:p>
-      <w:r>
-        <w:rPr>
-          <w:b/>
-        </w:rPr>
-        <w:t xml:space="preserve">Data Type: </w:t>
-      </w:r>
-      <w:r>
-        <w:t>DateTime (system-generated)</w:t>
-      </w:r>
-    </w:p>
-    <w:p>
-      <w:r>
-        <w:rPr>
-          <w:b/>
-        </w:rPr>
-        <w:t xml:space="preserve">Required: </w:t>
-      </w:r>
-      <w:r>
-        <w:t>Yes (auto-populated, not user-entered)</w:t>
-      </w:r>
-    </w:p>
-    <w:p>
-      <w:r>
-        <w:rPr>
-          <w:b/>
-        </w:rPr>
-        <w:t xml:space="preserve">Unique: </w:t>
-      </w:r>
-      <w:r>
-        <w:t>No</w:t>
-      </w:r>
-    </w:p>
-    <w:p>
-      <w:r>
-        <w:rPr>
-          <w:b/>
-        </w:rPr>
-        <w:t xml:space="preserve">Validation Rules: </w:t>
-      </w:r>
-      <w:r>
-        <w:t>- Automatically set to current system date/time via @default(now())</w:t>
-        <w:br/>
-        <w:t>- Read-only; not editable by users</w:t>
-        <w:br/>
-        <w:t>- Not affected by later edits to other fields</w:t>
-      </w:r>
-    </w:p>
-    <w:p>
-      <w:r>
-        <w:rPr>
-          <w:b/>
-        </w:rPr>
-        <w:t xml:space="preserve">Description: </w:t>
-      </w:r>
-      <w:r>
-        <w:t>Captures the exact date and time the department record was created. Used for audit trail and historical tracking.</w:t>
-      </w:r>
-    </w:p>
-    <w:p>
-      <w:pPr>
-        <w:pStyle w:val="Heading2"/>
-      </w:pPr>
-      <w:r>
-        <w:t>Date Updated (updatedAt)</w:t>
-      </w:r>
-    </w:p>
-    <w:p>
-      <w:r>
-        <w:rPr>
-          <w:b/>
-        </w:rPr>
-        <w:t xml:space="preserve">Data Type: </w:t>
-      </w:r>
-      <w:r>
-        <w:t>DateTime (system-generated)</w:t>
-      </w:r>
-    </w:p>
-    <w:p>
-      <w:r>
-        <w:rPr>
-          <w:b/>
-        </w:rPr>
-        <w:t xml:space="preserve">Required: </w:t>
-      </w:r>
-      <w:r>
-        <w:t>Yes (auto-updated)</w:t>
-      </w:r>
-    </w:p>
-    <w:p>
-      <w:r>
-        <w:rPr>
-          <w:b/>
-        </w:rPr>
-        <w:t xml:space="preserve">Unique: </w:t>
-      </w:r>
-      <w:r>
-        <w:t>No</w:t>
-      </w:r>
-    </w:p>
-    <w:p>
-      <w:r>
-        <w:rPr>
-          <w:b/>
-        </w:rPr>
-        <w:t xml:space="preserve">Validation Rules: </w:t>
-      </w:r>
-      <w:r>
-        <w:t>- Automatically updated on every record modification via @updatedAt</w:t>
-      </w:r>
-    </w:p>
-    <w:p>
-      <w:r>
-        <w:rPr>
-          <w:b/>
-        </w:rPr>
-        <w:t xml:space="preserve">Description: </w:t>
-      </w:r>
-      <w:r>
-        <w:t>Tracks the last modification timestamp for the department record.</w:t>
-      </w:r>
-    </w:p>
-    <w:p>
-      <w:pPr>
-        <w:pStyle w:val="Heading2"/>
-      </w:pPr>
-      <w:r>
-        <w:t>Active Status (isActive)</w:t>
-      </w:r>
-    </w:p>
-    <w:p>
-      <w:r>
-        <w:rPr>
-          <w:b/>
-        </w:rPr>
-        <w:t xml:space="preserve">Data Type: </w:t>
-      </w:r>
-      <w:r>
-        <w:t>Boolean (true/false)</w:t>
-      </w:r>
-    </w:p>
-    <w:p>
-      <w:r>
-        <w:rPr>
-          <w:b/>
-        </w:rPr>
-        <w:t xml:space="preserve">Required: </w:t>
-      </w:r>
-      <w:r>
-        <w:t>Yes — defaults to true on creation</w:t>
-      </w:r>
-    </w:p>
-    <w:p>
-      <w:r>
-        <w:rPr>
-          <w:b/>
-        </w:rPr>
-        <w:t xml:space="preserve">Unique: </w:t>
-      </w:r>
-      <w:r>
-        <w:t>No</w:t>
-      </w:r>
-    </w:p>
-    <w:p>
-      <w:r>
-        <w:rPr>
-          <w:b/>
-        </w:rPr>
-        <w:t xml:space="preserve">Validation Rules: </w:t>
-      </w:r>
-      <w:r>
-        <w:t>- Must be true or false</w:t>
-        <w:br/>
-        <w:t>- Toggled via toggleDepartmentActive() server action (Admin-only)</w:t>
-        <w:br/>
-        <w:t>- When set to false, department is excluded from active department queries (filtered with where: { isActive: true })</w:t>
-        <w:br/>
-        <w:t>- Inactive departments show "Inactive" badge on the admin DepartmentCard</w:t>
-      </w:r>
-    </w:p>
-    <w:p>
-      <w:r>
-        <w:rPr>
-          <w:b/>
-        </w:rPr>
-        <w:t xml:space="preserve">Description: </w:t>
-      </w:r>
-      <w:r>
-        <w:t>Controls whether the department is visible in dropdowns, filters, and department lists. Inactive departments are hidden from normal views but preserved in the database.</w:t>
+        <w:t>System-generated timestamp. Updated automatically on every modification.</w:t>
       </w:r>
     </w:p>
     <w:p>
@@ -1216,7 +928,7 @@
         <w:pStyle w:val="ListBullet"/>
       </w:pPr>
       <w:r>
-        <w:t>Departments form a hierarchical tree structure via the self-referential Parent Department (parentId) field.</w:t>
+        <w:t>There are three Level records: Executive, Management, Service. They exist at the top of the hierarchy.</w:t>
       </w:r>
     </w:p>
     <w:p>
@@ -1224,7 +936,7 @@
         <w:pStyle w:val="ListBullet"/>
       </w:pPr>
       <w:r>
-        <w:t>Top-level departments are identified by isParent = true and NULL parentId.</w:t>
+        <w:t>The three Level records are system-protected: they cannot be deleted, and their Level field cannot be changed.</w:t>
       </w:r>
     </w:p>
     <w:p>
@@ -1232,7 +944,7 @@
         <w:pStyle w:val="ListBullet"/>
       </w:pPr>
       <w:r>
-        <w:t>Sub-departments have isParent = false and a valid parentId referencing a parent department.</w:t>
+        <w:t>The three Level records are the only valid choices as parent when the candidate department has no parent set.</w:t>
       </w:r>
     </w:p>
     <w:p>
@@ -1240,7 +952,7 @@
         <w:pStyle w:val="ListBullet"/>
       </w:pPr>
       <w:r>
-        <w:t>A department's hierarchy depth is not limited by default — supports multi-level nesting.</w:t>
+        <w:t>Hierarchy depth is not limited by default; multi-level nesting is supported.</w:t>
       </w:r>
     </w:p>
     <w:p>
@@ -1248,7 +960,7 @@
         <w:pStyle w:val="ListBullet"/>
       </w:pPr>
       <w:r>
-        <w:t>Inactive departments (isActive = false) are excluded from all user-facing dropdown selections, filter options, and department lists.</w:t>
+        <w:t>A department under the Service Level is eligible for VA-to-client assignment workflows.</w:t>
       </w:r>
     </w:p>
     <w:p>
@@ -1256,7 +968,7 @@
         <w:pStyle w:val="ListBullet"/>
       </w:pPr>
       <w:r>
-        <w:t>Department names must be unique across the entire system (database-level constraint).</w:t>
+        <w:t>Circular parent-child relationships are strictly disallowed.</w:t>
       </w:r>
     </w:p>
     <w:p>
@@ -1264,7 +976,7 @@
         <w:pStyle w:val="ListBullet"/>
       </w:pPr>
       <w:r>
-        <w:t>Date Created (createdAt) is immutable once set and is not affected by any edit operations.</w:t>
+        <w:t>Date Created is immutable once set.</w:t>
       </w:r>
     </w:p>
     <w:p>
@@ -1272,7 +984,7 @@
         <w:pStyle w:val="ListBullet"/>
       </w:pPr>
       <w:r>
-        <w:t>Date Updated (updatedAt) is automatically updated on every record modification.</w:t>
+        <w:t>A department with active or inactive child departments cannot be deleted; reassign or deactivate children first.</w:t>
       </w:r>
     </w:p>
     <w:p>
@@ -1280,7 +992,7 @@
         <w:pStyle w:val="ListBullet"/>
       </w:pPr>
       <w:r>
-        <w:t>Only users with SUPER_ADMIN or SYSTEM_ADMIN roles can create, edit, or toggle department status.</w:t>
+        <w:t>Acronym must be unique system-wide. A duplicate acronym on create or update is rejected with a clear error.</w:t>
       </w:r>
     </w:p>
     <w:p>
@@ -1288,7 +1000,7 @@
         <w:pStyle w:val="ListBullet"/>
       </w:pPr>
       <w:r>
-        <w:t>Each department can have multiple Department Memberships linking users to departments with optional Position assignments.</w:t>
+        <w:t>Whitespace in name and short name is automatically trimmed on save.</w:t>
       </w:r>
     </w:p>
     <w:p>
@@ -1296,7 +1008,15 @@
         <w:pStyle w:val="ListBullet"/>
       </w:pPr>
       <w:r>
-        <w:t>Each department can have multiple Positions (job titles) defined within it.</w:t>
+        <w:t>Lowercase letters in acronym are automatically converted to uppercase.</w:t>
+      </w:r>
+    </w:p>
+    <w:p>
+      <w:pPr>
+        <w:pStyle w:val="Heading2"/>
+      </w:pPr>
+      <w:r>
+        <w:t>B. Merge Operation</w:t>
       </w:r>
     </w:p>
     <w:p>
@@ -1304,7 +1024,7 @@
         <w:pStyle w:val="ListBullet"/>
       </w:pPr>
       <w:r>
-        <w:t>Each department can have multiple Clients associated with it.</w:t>
+        <w:t>Merging combines two existing departments into a single resulting department.</w:t>
       </w:r>
     </w:p>
     <w:p>
@@ -1312,7 +1032,7 @@
         <w:pStyle w:val="ListBullet"/>
       </w:pPr>
       <w:r>
-        <w:t>Deleting a department sets the parentId of its children to NULL (onDelete: SetNull).</w:t>
+        <w:t>When Department A merges into Department B, A’s Status is set to Merged, and A’s Merged Into is set to B.</w:t>
       </w:r>
     </w:p>
     <w:p>
@@ -1320,7 +1040,7 @@
         <w:pStyle w:val="ListBullet"/>
       </w:pPr>
       <w:r>
-        <w:t>The /departments page displays active departments only, separated into Main Departments (isParent=true) and Sub-Departments (isParent=false).</w:t>
+        <w:t>A merged department becomes read-only going forward.</w:t>
       </w:r>
     </w:p>
     <w:p>
@@ -1328,7 +1048,31 @@
         <w:pStyle w:val="ListBullet"/>
       </w:pPr>
       <w:r>
-        <w:t>The dashboard supports department-scoped views via the ?dept= query parameter, filtering all data (clients, VAs, assignments, work logs) to the specified department.</w:t>
+        <w:t>All active memberships, clients, and sub-departments of A are automatically moved to B during the merge.</w:t>
+      </w:r>
+    </w:p>
+    <w:p>
+      <w:pPr>
+        <w:pStyle w:val="ListBullet"/>
+      </w:pPr>
+      <w:r>
+        <w:t>Only same-Level departments can merge (a Service department cannot merge into a Management department).</w:t>
+      </w:r>
+    </w:p>
+    <w:p>
+      <w:pPr>
+        <w:pStyle w:val="ListBullet"/>
+      </w:pPr>
+      <w:r>
+        <w:t>A merged department’s history remains visible in audit logs but is excluded from active selection lists.</w:t>
+      </w:r>
+    </w:p>
+    <w:p>
+      <w:pPr>
+        <w:pStyle w:val="ListBullet"/>
+      </w:pPr>
+      <w:r>
+        <w:t>Merging is not reversible through the UI; reversal requires manual data correction.</w:t>
       </w:r>
     </w:p>
     <w:p>
@@ -1336,275 +1080,55 @@
         <w:pStyle w:val="Heading2"/>
       </w:pPr>
       <w:r>
-        <w:t>B. Department Creation Flow</w:t>
-      </w:r>
-    </w:p>
-    <w:p>
-      <w:r>
-        <w:t>1. Admin navigates to /admin or /admin/users</w:t>
-        <w:br/>
-        <w:t>2. Enters department name (required) and optional description in the inline form</w:t>
-        <w:br/>
-        <w:t>3. Submits via createDepartmentInline server action</w:t>
-        <w:br/>
-        <w:t>4. Action validates: requires requireSuperAdmin(), checks name is truthy</w:t>
-        <w:br/>
-        <w:t>5. Department created with: name, description (or null), isParent = true, parentId = null</w:t>
-        <w:br/>
-        <w:t>6. Audit log recorded with action: CREATE, entityType: Department</w:t>
-        <w:br/>
-        <w:t>7. Paths revalidated: /admin/users, /admin, /departments</w:t>
-        <w:br/>
-        <w:t>8. UI updates immediately showing new department in the overview</w:t>
+        <w:t>C. Split Operation</w:t>
       </w:r>
     </w:p>
     <w:p>
       <w:pPr>
-        <w:pStyle w:val="Heading2"/>
+        <w:pStyle w:val="ListBullet"/>
       </w:pPr>
       <w:r>
-        <w:t>C. Department Editing Flow</w:t>
-      </w:r>
-    </w:p>
-    <w:p>
-      <w:r>
-        <w:t>1. On the admin DepartmentCard (in /admin), hover reveals Edit (pencil) and Toggle (on/off) buttons</w:t>
-        <w:br/>
-        <w:t>2. Clicking Edit switches the card to inline edit mode with name and description inputs</w:t>
-        <w:br/>
-        <w:t>3. Submit calls editDepartment server action (via .bind() to avoid serialization issues)</w:t>
-        <w:br/>
-        <w:t>4. Action reads name/description from FormData, trims whitespace, validates non-empty</w:t>
-        <w:br/>
-        <w:t>5. Updates via prisma.department.update({ where: { id }, data: { name, description } })</w:t>
-        <w:br/>
-        <w:t>6. Audit log recorded with action: UPDATE, entityType: Department, before/after values</w:t>
-        <w:br/>
-        <w:t>7. Toggle button calls toggleDepartmentActive to flip isActive (true ↔ false)</w:t>
-        <w:br/>
-        <w:t>8. Audit log recorded with action: STATUS_CHANGE</w:t>
-        <w:br/>
-        <w:t>9. Paths revalidated; all views update</w:t>
-        <w:br/>
-        <w:t>10. Client component state resets to exit edit mode</w:t>
+        <w:t>Splitting divides an existing department into two or more new department records.</w:t>
       </w:r>
     </w:p>
     <w:p>
       <w:pPr>
-        <w:pStyle w:val="Heading2"/>
+        <w:pStyle w:val="ListBullet"/>
       </w:pPr>
       <w:r>
-        <w:t>D. User Membership Management</w:t>
-      </w:r>
-    </w:p>
-    <w:p>
-      <w:r>
-        <w:t>Departments are associated with users through the DepartmentMembership junction table:</w:t>
-        <w:br/>
-        <w:br/>
-        <w:t>- Each membership links one User to one Department with an optional Position</w:t>
-        <w:br/>
-        <w:t>- Memberships can be marked as primary (isPrimary = true)</w:t>
-        <w:br/>
-        <w:t>- Memberships have startedAt and endedAt timestamps for historical tracking</w:t>
-        <w:br/>
-        <w:t>- Assigning: Admin selects department, optional position, and primary flag in UserCard</w:t>
-        <w:br/>
-        <w:t>- Removing: Click trash icon on membership badge; calls removeDepartmentMembership</w:t>
-        <w:br/>
-        <w:t>- Audit logged: MEMBER_ADD / MEMBER_REMOVE with department name metadata</w:t>
-        <w:br/>
-        <w:t>- users can have memberships in multiple departments simultaneously</w:t>
-        <w:br/>
-        <w:t>- Active memberships filter: where endedAt = null</w:t>
+        <w:t>When Department X is split into Departments Y and Z, both Y and Z are created with the same Level as X by default, and each has its Split From set to X.</w:t>
       </w:r>
     </w:p>
     <w:p>
       <w:pPr>
-        <w:pStyle w:val="Heading1"/>
+        <w:pStyle w:val="ListBullet"/>
       </w:pPr>
       <w:r>
-        <w:t>HIERARCHY STRUCTURE</w:t>
-      </w:r>
-    </w:p>
-    <w:p>
-      <w:r>
-        <w:t>Departments form a tree structure via the Parent Department field. The hierarchy is self-referential — each department can be both a parent and a child. The isParent boolean distinguishes main/parent-level departments from sub-departments.</w:t>
-      </w:r>
-    </w:p>
-    <w:p>
-      <w:r>
-        <w:t>Example hierarchy:</w:t>
-      </w:r>
-    </w:p>
-    <w:p>
-      <w:r>
-        <w:t>Admin (isParent: true, parentId: null)</w:t>
-        <w:br/>
-        <w:t>└ HR</w:t>
-        <w:br/>
-        <w:t>Operations (isParent: true, parentId: null)</w:t>
-        <w:br/>
-        <w:t>└ Service Dept A</w:t>
-        <w:br/>
-        <w:t>└ Service Dept B</w:t>
-        <w:br/>
-        <w:t xml:space="preserve">    └ (further nesting supported)</w:t>
-      </w:r>
-    </w:p>
-    <w:p>
-      <w:r>
-        <w:t>The /departments page renders Main Departments (isParent=true) and Sub-Departments (isParent=false) in separate grid sections. Each card links to /dashboard?dept={id} which scopes the entire dashboard to that department's data.</w:t>
+        <w:t>X’s Status is set to Split, and X becomes read-only going forward.</w:t>
       </w:r>
     </w:p>
     <w:p>
       <w:pPr>
-        <w:pStyle w:val="Heading1"/>
+        <w:pStyle w:val="ListBullet"/>
       </w:pPr>
       <w:r>
-        <w:t>DATABASE SCHEMA</w:t>
+        <w:t>Memberships, clients, and sub-departments under X can be distributed across the new departments via the split wizard.</w:t>
       </w:r>
     </w:p>
     <w:p>
       <w:pPr>
-        <w:pStyle w:val="Heading2"/>
+        <w:pStyle w:val="ListBullet"/>
       </w:pPr>
       <w:r>
-        <w:t>Department Model</w:t>
-      </w:r>
-    </w:p>
-    <w:p>
-      <w:r>
-        <w:t>model Department {</w:t>
-        <w:br/>
-        <w:t xml:space="preserve">  id          String        @id @default(cuid())</w:t>
-        <w:br/>
-        <w:t xml:space="preserve">  name        String        @unique</w:t>
-        <w:br/>
-        <w:t xml:space="preserve">  parentId    String?       @map("parent_id")</w:t>
-        <w:br/>
-        <w:t xml:space="preserve">  parent      Department?   @relation("DeptHierarchy", fields: [parentId], references: [id], onDelete: SetNull)</w:t>
-        <w:br/>
-        <w:t xml:space="preserve">  children    Department[]  @relation("DeptHierarchy")</w:t>
-        <w:br/>
-        <w:t xml:space="preserve">  isParent    Boolean       @default(false) @map("is_parent")</w:t>
-        <w:br/>
-        <w:t xml:space="preserve">  description String?</w:t>
-        <w:br/>
-        <w:t xml:space="preserve">  headId      String?       @map("head_id")</w:t>
-        <w:br/>
-        <w:t xml:space="preserve">  head        User?         @relation("DeptHead", fields: [headId], references: [id], onDelete: SetNull)</w:t>
-        <w:br/>
-        <w:t xml:space="preserve">  sortOrder   Int           @default(0) @map("sort_order")</w:t>
-        <w:br/>
-        <w:t xml:space="preserve">  isActive    Boolean       @default(true) @map("is_active")</w:t>
-        <w:br/>
-        <w:t xml:space="preserve">  createdAt   DateTime      @default(now()) @map("created_at")</w:t>
-        <w:br/>
-        <w:t xml:space="preserve">  updatedAt   DateTime      @updatedAt @map("updated_at")</w:t>
-        <w:br/>
-        <w:br/>
-        <w:t xml:space="preserve">  memberships     DepartmentMembership[]</w:t>
-        <w:br/>
-        <w:t xml:space="preserve">  positions       Position[]</w:t>
-        <w:br/>
-        <w:t xml:space="preserve">  clients         Client[]</w:t>
-        <w:br/>
-        <w:t xml:space="preserve">  tickets         Ticket[]</w:t>
-        <w:br/>
-        <w:t xml:space="preserve">  auditLogs       AuditLog[]</w:t>
-        <w:br/>
-        <w:t xml:space="preserve">  roleAssignments RoleAssignment[]</w:t>
-        <w:br/>
-        <w:br/>
-        <w:t xml:space="preserve">  @@map("departments")</w:t>
-        <w:br/>
-        <w:t>}</w:t>
+        <w:t>New departments created via split are subject to all standard field validations (uniqueness of name/acronym, required fields).</w:t>
       </w:r>
     </w:p>
     <w:p>
       <w:pPr>
-        <w:pStyle w:val="Heading2"/>
+        <w:pStyle w:val="ListBullet"/>
       </w:pPr>
       <w:r>
-        <w:t>DepartmentMembership Model</w:t>
-      </w:r>
-    </w:p>
-    <w:p>
-      <w:r>
-        <w:t>model DepartmentMembership {</w:t>
-        <w:br/>
-        <w:t xml:space="preserve">  id           String        @id @default(cuid())</w:t>
-        <w:br/>
-        <w:t xml:space="preserve">  userId       String        @map("user_id")</w:t>
-        <w:br/>
-        <w:t xml:space="preserve">  user         User          @relation(fields: [userId], references: [id], onDelete: Cascade)</w:t>
-        <w:br/>
-        <w:t xml:space="preserve">  departmentId String        @map("department_id")</w:t>
-        <w:br/>
-        <w:t xml:space="preserve">  department   Department    @relation(fields: [departmentId], references: [id], onDelete: Cascade)</w:t>
-        <w:br/>
-        <w:t xml:space="preserve">  positionId   String?       @map("position_id")</w:t>
-        <w:br/>
-        <w:t xml:space="preserve">  position     Position?     @relation(fields: [positionId], references: [id], onDelete: SetNull)</w:t>
-        <w:br/>
-        <w:t xml:space="preserve">  isPrimary    Boolean       @default(false) @map("is_primary")</w:t>
-        <w:br/>
-        <w:t xml:space="preserve">  startedAt    DateTime      @default(now()) @map("started_at")</w:t>
-        <w:br/>
-        <w:t xml:space="preserve">  endedAt      DateTime?     @map("ended_at")</w:t>
-        <w:br/>
-        <w:t xml:space="preserve">  createdAt    DateTime      @default(now()) @map("created_at")</w:t>
-        <w:br/>
-        <w:t xml:space="preserve">  updatedAt    DateTime      @updatedAt @map("updated_at")</w:t>
-        <w:br/>
-        <w:br/>
-        <w:t xml:space="preserve">  @@unique([userId, departmentId])</w:t>
-        <w:br/>
-        <w:t xml:space="preserve">  @@map("department_memberships")</w:t>
-        <w:br/>
-        <w:t>}</w:t>
-      </w:r>
-    </w:p>
-    <w:p>
-      <w:pPr>
-        <w:pStyle w:val="Heading2"/>
-      </w:pPr>
-      <w:r>
-        <w:t>Position Model</w:t>
-      </w:r>
-    </w:p>
-    <w:p>
-      <w:r>
-        <w:t>model Position {</w:t>
-        <w:br/>
-        <w:t xml:space="preserve">  id           String        @id @default(cuid())</w:t>
-        <w:br/>
-        <w:t xml:space="preserve">  title        String</w:t>
-        <w:br/>
-        <w:t xml:space="preserve">  reportsToId  String?       @map("reports_to_id")</w:t>
-        <w:br/>
-        <w:t xml:space="preserve">  reportsTo    Position?     @relation("PositionChain", fields: [reportsToId], references: [id], onDelete: SetNull)</w:t>
-        <w:br/>
-        <w:t xml:space="preserve">  subordinates Position[]    @relation("PositionChain")</w:t>
-        <w:br/>
-        <w:t xml:space="preserve">  departmentId String?       @map("department_id")</w:t>
-        <w:br/>
-        <w:t xml:space="preserve">  department   Department?   @relation(fields: [departmentId], references: [id], onDelete: SetNull)</w:t>
-        <w:br/>
-        <w:t xml:space="preserve">  isStaffRole  Boolean       @default(false) @map("is_staff_role")</w:t>
-        <w:br/>
-        <w:t xml:space="preserve">  sortOrder    Int           @default(0) @map("sort_order")</w:t>
-        <w:br/>
-        <w:t xml:space="preserve">  isActive     Boolean       @default(true) @map("is_active")</w:t>
-        <w:br/>
-        <w:t xml:space="preserve">  createdAt    DateTime      @default(now()) @map("created_at")</w:t>
-        <w:br/>
-        <w:t xml:space="preserve">  updatedAt    DateTime      @updatedAt @map("updated_at")</w:t>
-        <w:br/>
-        <w:t xml:space="preserve">  @@map("positions")</w:t>
-        <w:br/>
-        <w:t>}</w:t>
+        <w:t>A department can only be split if it is currently Active and not a Level record.</w:t>
       </w:r>
     </w:p>
     <w:p>
@@ -1620,22 +1144,57 @@
         <w:pStyle w:val="Heading2"/>
       </w:pPr>
       <w:r>
-        <w:t>/departments — Department Directory</w:t>
+        <w:t>/admin/departments — Department Management</w:t>
       </w:r>
     </w:p>
     <w:p>
       <w:r>
-        <w:t>The main department navigation page. Displays all active departments separated into "Main Departments" (isParent=true) and "Sub-Departments &amp; Teams" (isParent=false) in responsive card grids. Each card shows:</w:t>
-        <w:br/>
-        <w:t>- Department name with icon (based on name: HR→Users, Operations→Briefcase, Admin→Shield, default→Building)</w:t>
-        <w:br/>
-        <w:t>- Description (if set)</w:t>
-        <w:br/>
-        <w:t>- Member count and client count</w:t>
-        <w:br/>
-        <w:t>- "Enter" link to /dashboard?dept={id}</w:t>
-        <w:br/>
-        <w:t>- If no departments exist, shows empty state with link to Admin Panel</w:t>
+        <w:t>Main entry point for all department management. Lists every department grouped by Level (Executive, Management, Service). Each row shows name, acronym, level, status, parent, counts of sub-departments / members / clients, and contextual action buttons.</w:t>
+      </w:r>
+    </w:p>
+    <w:p>
+      <w:r>
+        <w:t>Action buttons per row:</w:t>
+      </w:r>
+    </w:p>
+    <w:p>
+      <w:pPr>
+        <w:pStyle w:val="ListBullet"/>
+      </w:pPr>
+      <w:r>
+        <w:t>Merge — only shown for active, non-Level departments. Navigates to the merge wizard.</w:t>
+      </w:r>
+    </w:p>
+    <w:p>
+      <w:pPr>
+        <w:pStyle w:val="ListBullet"/>
+      </w:pPr>
+      <w:r>
+        <w:t>Split — only shown for active, non-Level departments. Navigates to the split wizard.</w:t>
+      </w:r>
+    </w:p>
+    <w:p>
+      <w:pPr>
+        <w:pStyle w:val="ListBullet"/>
+      </w:pPr>
+      <w:r>
+        <w:t>Toggle — flips status between Active and Inactive. Hidden for Level records.</w:t>
+      </w:r>
+    </w:p>
+    <w:p>
+      <w:pPr>
+        <w:pStyle w:val="ListBullet"/>
+      </w:pPr>
+      <w:r>
+        <w:t>Delete — removes the department. Hidden for Level records and departments with children.</w:t>
+      </w:r>
+    </w:p>
+    <w:p>
+      <w:pPr>
+        <w:pStyle w:val="ListBullet"/>
+      </w:pPr>
+      <w:r>
+        <w:t>Open dashboard — navigates to /dashboard?dept={id} for that department’s scoped view.</w:t>
       </w:r>
     </w:p>
     <w:p>
@@ -1643,15 +1202,12 @@
         <w:pStyle w:val="Heading2"/>
       </w:pPr>
       <w:r>
-        <w:t>/dashboard?dept={id} — Department-Scoped Dashboard</w:t>
+        <w:t>/admin/departments/merge/[id] — Merge Wizard</w:t>
       </w:r>
     </w:p>
     <w:p>
       <w:r>
-        <w:t>When a department is selected, the main dashboard scopes all its data to that department. The header displays the department name with a "Switch department" link back to /departments. SUPER_ADMIN and SYSTEM_ADMIN users are redirected to /departments if no department is selected.</w:t>
-        <w:br/>
-        <w:br/>
-        <w:t>Scoped data includes: clients, VAs, assignments, and work logs filtered by departmentId.</w:t>
+        <w:t>Two-step wizard for safely merging one department into another. Step 1 shows a grid of eligible target departments (same Level, active, not Level records). Step 2 displays the impact preview: counts of memberships, clients, assignments, and sub-departments that will move. A confirmation checkbox is required before the merge executes.</w:t>
       </w:r>
     </w:p>
     <w:p>
@@ -1659,22 +1215,12 @@
         <w:pStyle w:val="Heading2"/>
       </w:pPr>
       <w:r>
-        <w:t>/admin — Admin Panel (Department Overview)</w:t>
+        <w:t>/admin/departments/split/[id] — Split Wizard</w:t>
       </w:r>
     </w:p>
     <w:p>
       <w:r>
-        <w:t>Shows all active departments in a card grid with:</w:t>
-        <w:br/>
-        <w:t>- Inline create form: enter name + description, click "Add"</w:t>
-        <w:br/>
-        <w:t>- Each DepartmentCard supports inline editing (rename, description) and active/inactive toggle</w:t>
-        <w:br/>
-        <w:t>- Department cards show member count and client count</w:t>
-        <w:br/>
-        <w:t>- Clicking a department card navigates to /dashboard?dept={id}</w:t>
-        <w:br/>
-        <w:t>- Links to bulk department management via /departments and /admin/users</w:t>
+        <w:t>Multi-card split wizard. The source department’s data summary is shown at the top. Below are 2 to N new department cards. Each card has fields for name, short name, acronym, and optional parent. Each card also has checkbox lists to assign which members, clients, and sub-departments will move to that new department. A summary at the bottom warns about any unassigned items that will remain with the source. A confirmation checkbox is required before the split executes.</w:t>
       </w:r>
     </w:p>
     <w:p>
@@ -1682,33 +1228,12 @@
         <w:pStyle w:val="Heading2"/>
       </w:pPr>
       <w:r>
-        <w:t>/admin/users — User Management (Membership Control)</w:t>
+        <w:t>/departments — Department Directory</w:t>
       </w:r>
     </w:p>
     <w:p>
       <w:r>
-        <w:t>The UserCard component includes department membership management:</w:t>
-        <w:br/>
-        <w:t>- Display: existing memberships as badges with department name, position title, primary star</w:t>
-        <w:br/>
-        <w:t>- Assign: select department, optional position, primary checkbox, click "Assign"</w:t>
-        <w:br/>
-        <w:t>- Remove: click trash icon on any membership badge</w:t>
-        <w:br/>
-        <w:t>- Filter: filter users by department via the FilterBar dropdown</w:t>
-      </w:r>
-    </w:p>
-    <w:p>
-      <w:pPr>
-        <w:pStyle w:val="Heading2"/>
-      </w:pPr>
-      <w:r>
-        <w:t>/vas?dept={id} — VA Roster (Department Filter)</w:t>
-      </w:r>
-    </w:p>
-    <w:p>
-      <w:r>
-        <w:t>The VA roster supports filtering by department via the FilterBar. When a department is selected, only VAs who are members of that department are shown. The table displays Dept / Position column showing primary membership information.</w:t>
+        <w:t>Read-only directory of all active departments. Displays parent departments in a Main Departments grid and sub-departments in a Sub-Departments grid. Each card links to the department-scoped dashboard.</w:t>
       </w:r>
     </w:p>
     <w:p>
@@ -1716,20 +1241,12 @@
         <w:pStyle w:val="Heading1"/>
       </w:pPr>
       <w:r>
-        <w:t>SERVER ACTIONS</w:t>
+        <w:t>AUDIT TRAIL</w:t>
       </w:r>
     </w:p>
     <w:p>
       <w:r>
-        <w:t>All department-related server actions are in app/(dashboard)/admin/users/actions.ts:</w:t>
-      </w:r>
-    </w:p>
-    <w:p>
-      <w:r>
-        <w:rPr>
-          <w:b/>
-        </w:rPr>
-        <w:t>createDepartment(name, description, isParent, parentId)</w:t>
+        <w:t>All department operations are recorded in the system audit log. The following events are captured automatically:</w:t>
       </w:r>
     </w:p>
     <w:p>
@@ -1737,15 +1254,7 @@
         <w:pStyle w:val="ListBullet"/>
       </w:pPr>
       <w:r>
-        <w:t>Creates a new department with full field control. Requires Super Admin. Logs CREATE audit.</w:t>
-      </w:r>
-    </w:p>
-    <w:p>
-      <w:r>
-        <w:rPr>
-          <w:b/>
-        </w:rPr>
-        <w:t>createDepartmentInline(formData)</w:t>
+        <w:t>CREATE — when a new department is created</w:t>
       </w:r>
     </w:p>
     <w:p>
@@ -1753,15 +1262,7 @@
         <w:pStyle w:val="ListBullet"/>
       </w:pPr>
       <w:r>
-        <w:t>Creates a department from the inline form. Auto-sets isParent=true, parentId=null. Logs CREATE audit.</w:t>
-      </w:r>
-    </w:p>
-    <w:p>
-      <w:r>
-        <w:rPr>
-          <w:b/>
-        </w:rPr>
-        <w:t>updateDepartment(id, data)</w:t>
+        <w:t>UPDATE — when a department’s name, short name, acronym, level, description, parent, or status is modified</w:t>
       </w:r>
     </w:p>
     <w:p>
@@ -1769,15 +1270,7 @@
         <w:pStyle w:val="ListBullet"/>
       </w:pPr>
       <w:r>
-        <w:t>Updates department fields (name, description, isParent, parentId, isActive). Captures before state. Logs UPDATE audit.</w:t>
-      </w:r>
-    </w:p>
-    <w:p>
-      <w:r>
-        <w:rPr>
-          <w:b/>
-        </w:rPr>
-        <w:t>editDepartment(id, formData)</w:t>
+        <w:t>STATUS_CHANGE — when a department is toggled between Active and Inactive</w:t>
       </w:r>
     </w:p>
     <w:p>
@@ -1785,15 +1278,7 @@
         <w:pStyle w:val="ListBullet"/>
       </w:pPr>
       <w:r>
-        <w:t>Form-based edit for name and description. Trims whitespace. Logs UPDATE audit with before/after diff.</w:t>
-      </w:r>
-    </w:p>
-    <w:p>
-      <w:r>
-        <w:rPr>
-          <w:b/>
-        </w:rPr>
-        <w:t>toggleDepartmentActive(id)</w:t>
+        <w:t>DELETE — when a department is deleted</w:t>
       </w:r>
     </w:p>
     <w:p>
@@ -1801,15 +1286,7 @@
         <w:pStyle w:val="ListBullet"/>
       </w:pPr>
       <w:r>
-        <w:t>Flips isActive (true→false, false→true). Captures before state. Logs STATUS_CHANGE audit with department name.</w:t>
-      </w:r>
-    </w:p>
-    <w:p>
-      <w:r>
-        <w:rPr>
-          <w:b/>
-        </w:rPr>
-        <w:t>assignDepartmentMembership(userId, departmentId, positionId, isPrimary)</w:t>
+        <w:t>TRANSFER (with operation: MERGE) — when one department is merged into another</w:t>
       </w:r>
     </w:p>
     <w:p>
@@ -1817,15 +1294,7 @@
         <w:pStyle w:val="ListBullet"/>
       </w:pPr>
       <w:r>
-        <w:t>Creates or updates a user membership. Handles primary flag (demotes existing primary). Logs MEMBER_ADD or UPDATE audit.</w:t>
-      </w:r>
-    </w:p>
-    <w:p>
-      <w:r>
-        <w:rPr>
-          <w:b/>
-        </w:rPr>
-        <w:t>removeDepartmentMembership(membershipId)</w:t>
+        <w:t>CREATE (with splitFromId, operation: SPLIT) — for each new department created via split</w:t>
       </w:r>
     </w:p>
     <w:p>
@@ -1833,7 +1302,12 @@
         <w:pStyle w:val="ListBullet"/>
       </w:pPr>
       <w:r>
-        <w:t>Deletes a membership. Captures before state including user email and department name. Logs MEMBER_REMOVE audit.</w:t>
+        <w:t>TRANSFER (with operation: SPLIT) — for the source department set to SPLIT</w:t>
+      </w:r>
+    </w:p>
+    <w:p>
+      <w:r>
+        <w:t>Audit entries include before/after values, metadata (target name, entity counts), and actor information. Viewable at /admin/audit (Super Admin / System Admin only).</w:t>
       </w:r>
     </w:p>
     <w:p>
@@ -1859,16 +1333,15 @@
         <w:tblLook w:firstColumn="1" w:firstRow="1" w:lastColumn="0" w:lastRow="0" w:noHBand="0" w:noVBand="1" w:val="04A0"/>
       </w:tblPr>
       <w:tblGrid>
-        <w:gridCol w:w="1728"/>
-        <w:gridCol w:w="1728"/>
-        <w:gridCol w:w="1728"/>
-        <w:gridCol w:w="1728"/>
-        <w:gridCol w:w="1728"/>
+        <w:gridCol w:w="2160"/>
+        <w:gridCol w:w="2160"/>
+        <w:gridCol w:w="2160"/>
+        <w:gridCol w:w="2160"/>
       </w:tblGrid>
       <w:tr>
         <w:tc>
           <w:tcPr>
-            <w:tcW w:type="dxa" w:w="1728"/>
+            <w:tcW w:type="dxa" w:w="2160"/>
           </w:tcPr>
           <w:p>
             <w:r>
@@ -1881,7 +1354,7 @@
         </w:tc>
         <w:tc>
           <w:tcPr>
-            <w:tcW w:type="dxa" w:w="1728"/>
+            <w:tcW w:type="dxa" w:w="2160"/>
           </w:tcPr>
           <w:p>
             <w:r>
@@ -1894,20 +1367,7 @@
         </w:tc>
         <w:tc>
           <w:tcPr>
-            <w:tcW w:type="dxa" w:w="1728"/>
-          </w:tcPr>
-          <w:p>
-            <w:r>
-              <w:rPr>
-                <w:b/>
-              </w:rPr>
-              <w:t>Test Steps</w:t>
-            </w:r>
-          </w:p>
-        </w:tc>
-        <w:tc>
-          <w:tcPr>
-            <w:tcW w:type="dxa" w:w="1728"/>
+            <w:tcW w:type="dxa" w:w="2160"/>
           </w:tcPr>
           <w:p>
             <w:r>
@@ -1920,7 +1380,7 @@
         </w:tc>
         <w:tc>
           <w:tcPr>
-            <w:tcW w:type="dxa" w:w="1728"/>
+            <w:tcW w:type="dxa" w:w="2160"/>
           </w:tcPr>
           <w:p>
             <w:r>
@@ -1935,7 +1395,7 @@
       <w:tr>
         <w:tc>
           <w:tcPr>
-            <w:tcW w:type="dxa" w:w="1728"/>
+            <w:tcW w:type="dxa" w:w="2160"/>
           </w:tcPr>
           <w:p>
             <w:r>
@@ -1945,37 +1405,27 @@
         </w:tc>
         <w:tc>
           <w:tcPr>
-            <w:tcW w:type="dxa" w:w="1728"/>
+            <w:tcW w:type="dxa" w:w="2160"/>
           </w:tcPr>
           <w:p>
             <w:r>
-              <w:t>Create department with all valid fields</w:t>
+              <w:t>Create with all valid fields</w:t>
             </w:r>
           </w:p>
         </w:tc>
         <w:tc>
           <w:tcPr>
-            <w:tcW w:type="dxa" w:w="1728"/>
+            <w:tcW w:type="dxa" w:w="2160"/>
           </w:tcPr>
           <w:p>
             <w:r>
-              <w:t>Enter name and description; click Add</w:t>
+              <w:t>Department is created with all fields populated, Date Created auto-populated, Status defaults to Active</w:t>
             </w:r>
           </w:p>
         </w:tc>
         <w:tc>
           <w:tcPr>
-            <w:tcW w:type="dxa" w:w="1728"/>
-          </w:tcPr>
-          <w:p>
-            <w:r>
-              <w:t>Department created with isParent=true, isActive=true, createdAt auto-populated, audit log recorded</w:t>
-            </w:r>
-          </w:p>
-        </w:tc>
-        <w:tc>
-          <w:tcPr>
-            <w:tcW w:type="dxa" w:w="1728"/>
+            <w:tcW w:type="dxa" w:w="2160"/>
           </w:tcPr>
           <w:p>
             <w:r>
@@ -1987,7 +1437,7 @@
       <w:tr>
         <w:tc>
           <w:tcPr>
-            <w:tcW w:type="dxa" w:w="1728"/>
+            <w:tcW w:type="dxa" w:w="2160"/>
           </w:tcPr>
           <w:p>
             <w:r>
@@ -1997,37 +1447,27 @@
         </w:tc>
         <w:tc>
           <w:tcPr>
-            <w:tcW w:type="dxa" w:w="1728"/>
+            <w:tcW w:type="dxa" w:w="2160"/>
           </w:tcPr>
           <w:p>
             <w:r>
-              <w:t>Create department with blank name</w:t>
+              <w:t>Blank Department Name</w:t>
             </w:r>
           </w:p>
         </w:tc>
         <w:tc>
           <w:tcPr>
-            <w:tcW w:type="dxa" w:w="1728"/>
+            <w:tcW w:type="dxa" w:w="2160"/>
           </w:tcPr>
           <w:p>
             <w:r>
-              <w:t>Leave name empty; submit form</w:t>
+              <w:t>Validation rejects blank name with clear error message</w:t>
             </w:r>
           </w:p>
         </w:tc>
         <w:tc>
           <w:tcPr>
-            <w:tcW w:type="dxa" w:w="1728"/>
-          </w:tcPr>
-          <w:p>
-            <w:r>
-              <w:t>Form does not submit (HTML required attribute / server-side null check)</w:t>
-            </w:r>
-          </w:p>
-        </w:tc>
-        <w:tc>
-          <w:tcPr>
-            <w:tcW w:type="dxa" w:w="1728"/>
+            <w:tcW w:type="dxa" w:w="2160"/>
           </w:tcPr>
           <w:p>
             <w:r>
@@ -2039,7 +1479,7 @@
       <w:tr>
         <w:tc>
           <w:tcPr>
-            <w:tcW w:type="dxa" w:w="1728"/>
+            <w:tcW w:type="dxa" w:w="2160"/>
           </w:tcPr>
           <w:p>
             <w:r>
@@ -2049,37 +1489,27 @@
         </w:tc>
         <w:tc>
           <w:tcPr>
-            <w:tcW w:type="dxa" w:w="1728"/>
+            <w:tcW w:type="dxa" w:w="2160"/>
           </w:tcPr>
           <w:p>
             <w:r>
-              <w:t>Create department with duplicate name</w:t>
+              <w:t>Duplicate Department Name</w:t>
             </w:r>
           </w:p>
         </w:tc>
         <w:tc>
           <w:tcPr>
-            <w:tcW w:type="dxa" w:w="1728"/>
+            <w:tcW w:type="dxa" w:w="2160"/>
           </w:tcPr>
           <w:p>
             <w:r>
-              <w:t>Enter name that already exists</w:t>
+              <w:t>Validation rejects duplicate name with "department name already exists" error</w:t>
             </w:r>
           </w:p>
         </w:tc>
         <w:tc>
           <w:tcPr>
-            <w:tcW w:type="dxa" w:w="1728"/>
-          </w:tcPr>
-          <w:p>
-            <w:r>
-              <w:t>Database unique constraint rejects; error surfaced to user</w:t>
-            </w:r>
-          </w:p>
-        </w:tc>
-        <w:tc>
-          <w:tcPr>
-            <w:tcW w:type="dxa" w:w="1728"/>
+            <w:tcW w:type="dxa" w:w="2160"/>
           </w:tcPr>
           <w:p>
             <w:r>
@@ -2091,7 +1521,7 @@
       <w:tr>
         <w:tc>
           <w:tcPr>
-            <w:tcW w:type="dxa" w:w="1728"/>
+            <w:tcW w:type="dxa" w:w="2160"/>
           </w:tcPr>
           <w:p>
             <w:r>
@@ -2101,37 +1531,27 @@
         </w:tc>
         <w:tc>
           <w:tcPr>
-            <w:tcW w:type="dxa" w:w="1728"/>
+            <w:tcW w:type="dxa" w:w="2160"/>
           </w:tcPr>
           <w:p>
             <w:r>
-              <w:t>Edit department name via inline edit</w:t>
+              <w:t>Duplicate Acronym</w:t>
             </w:r>
           </w:p>
         </w:tc>
         <w:tc>
           <w:tcPr>
-            <w:tcW w:type="dxa" w:w="1728"/>
+            <w:tcW w:type="dxa" w:w="2160"/>
           </w:tcPr>
           <w:p>
             <w:r>
-              <w:t>Click pencil, change name, click check</w:t>
+              <w:t>Validation rejects duplicate acronym with "acronym already in use" error</w:t>
             </w:r>
           </w:p>
         </w:tc>
         <w:tc>
           <w:tcPr>
-            <w:tcW w:type="dxa" w:w="1728"/>
-          </w:tcPr>
-          <w:p>
-            <w:r>
-              <w:t>Name updated; audit log records before/after; department list refreshes</w:t>
-            </w:r>
-          </w:p>
-        </w:tc>
-        <w:tc>
-          <w:tcPr>
-            <w:tcW w:type="dxa" w:w="1728"/>
+            <w:tcW w:type="dxa" w:w="2160"/>
           </w:tcPr>
           <w:p>
             <w:r>
@@ -2143,7 +1563,7 @@
       <w:tr>
         <w:tc>
           <w:tcPr>
-            <w:tcW w:type="dxa" w:w="1728"/>
+            <w:tcW w:type="dxa" w:w="2160"/>
           </w:tcPr>
           <w:p>
             <w:r>
@@ -2153,37 +1573,27 @@
         </w:tc>
         <w:tc>
           <w:tcPr>
-            <w:tcW w:type="dxa" w:w="1728"/>
+            <w:tcW w:type="dxa" w:w="2160"/>
           </w:tcPr>
           <w:p>
             <w:r>
-              <w:t>Edit department description</w:t>
+              <w:t>Blank Short Name</w:t>
             </w:r>
           </w:p>
         </w:tc>
         <w:tc>
           <w:tcPr>
-            <w:tcW w:type="dxa" w:w="1728"/>
+            <w:tcW w:type="dxa" w:w="2160"/>
           </w:tcPr>
           <w:p>
             <w:r>
-              <w:t>Click pencil, change description, click check</w:t>
+              <w:t>Short Name is treated as optional; blank value accepted as null</w:t>
             </w:r>
           </w:p>
         </w:tc>
         <w:tc>
           <w:tcPr>
-            <w:tcW w:type="dxa" w:w="1728"/>
-          </w:tcPr>
-          <w:p>
-            <w:r>
-              <w:t>Description updated; whitespace auto-trimmed; audit logged</w:t>
-            </w:r>
-          </w:p>
-        </w:tc>
-        <w:tc>
-          <w:tcPr>
-            <w:tcW w:type="dxa" w:w="1728"/>
+            <w:tcW w:type="dxa" w:w="2160"/>
           </w:tcPr>
           <w:p>
             <w:r>
@@ -2195,7 +1605,7 @@
       <w:tr>
         <w:tc>
           <w:tcPr>
-            <w:tcW w:type="dxa" w:w="1728"/>
+            <w:tcW w:type="dxa" w:w="2160"/>
           </w:tcPr>
           <w:p>
             <w:r>
@@ -2205,37 +1615,27 @@
         </w:tc>
         <w:tc>
           <w:tcPr>
-            <w:tcW w:type="dxa" w:w="1728"/>
+            <w:tcW w:type="dxa" w:w="2160"/>
           </w:tcPr>
           <w:p>
             <w:r>
-              <w:t>Toggle department active/inactive</w:t>
+              <w:t>Lowercase Acronym</w:t>
             </w:r>
           </w:p>
         </w:tc>
         <w:tc>
           <w:tcPr>
-            <w:tcW w:type="dxa" w:w="1728"/>
+            <w:tcW w:type="dxa" w:w="2160"/>
           </w:tcPr>
           <w:p>
             <w:r>
-              <w:t>Click toggle (on/off) button on hover</w:t>
+              <w:t>Lowercase input is auto-converted to uppercase before save</w:t>
             </w:r>
           </w:p>
         </w:tc>
         <w:tc>
           <w:tcPr>
-            <w:tcW w:type="dxa" w:w="1728"/>
-          </w:tcPr>
-          <w:p>
-            <w:r>
-              <w:t>isActive flips; STATUS_CHANGE audit logged; inactive badge appears/disappears</w:t>
-            </w:r>
-          </w:p>
-        </w:tc>
-        <w:tc>
-          <w:tcPr>
-            <w:tcW w:type="dxa" w:w="1728"/>
+            <w:tcW w:type="dxa" w:w="2160"/>
           </w:tcPr>
           <w:p>
             <w:r>
@@ -2247,7 +1647,7 @@
       <w:tr>
         <w:tc>
           <w:tcPr>
-            <w:tcW w:type="dxa" w:w="1728"/>
+            <w:tcW w:type="dxa" w:w="2160"/>
           </w:tcPr>
           <w:p>
             <w:r>
@@ -2257,37 +1657,27 @@
         </w:tc>
         <w:tc>
           <w:tcPr>
-            <w:tcW w:type="dxa" w:w="1728"/>
+            <w:tcW w:type="dxa" w:w="2160"/>
           </w:tcPr>
           <w:p>
             <w:r>
-              <w:t>Inactive department hidden from views</w:t>
+              <w:t>Blank Level</w:t>
             </w:r>
           </w:p>
         </w:tc>
         <w:tc>
           <w:tcPr>
-            <w:tcW w:type="dxa" w:w="1728"/>
+            <w:tcW w:type="dxa" w:w="2160"/>
           </w:tcPr>
           <w:p>
             <w:r>
-              <w:t>Toggle department inactive; visit /departments</w:t>
+              <w:t>Validation rejects blank Level with "level is required" error</w:t>
             </w:r>
           </w:p>
         </w:tc>
         <w:tc>
           <w:tcPr>
-            <w:tcW w:type="dxa" w:w="1728"/>
-          </w:tcPr>
-          <w:p>
-            <w:r>
-              <w:t>Department not shown in active department lists or filter dropdowns</w:t>
-            </w:r>
-          </w:p>
-        </w:tc>
-        <w:tc>
-          <w:tcPr>
-            <w:tcW w:type="dxa" w:w="1728"/>
+            <w:tcW w:type="dxa" w:w="2160"/>
           </w:tcPr>
           <w:p>
             <w:r>
@@ -2299,7 +1689,7 @@
       <w:tr>
         <w:tc>
           <w:tcPr>
-            <w:tcW w:type="dxa" w:w="1728"/>
+            <w:tcW w:type="dxa" w:w="2160"/>
           </w:tcPr>
           <w:p>
             <w:r>
@@ -2309,37 +1699,27 @@
         </w:tc>
         <w:tc>
           <w:tcPr>
-            <w:tcW w:type="dxa" w:w="1728"/>
+            <w:tcW w:type="dxa" w:w="2160"/>
           </w:tcPr>
           <w:p>
             <w:r>
-              <w:t>Department appears in filter dropdown</w:t>
+              <w:t>Invalid Level value</w:t>
             </w:r>
           </w:p>
         </w:tc>
         <w:tc>
           <w:tcPr>
-            <w:tcW w:type="dxa" w:w="1728"/>
+            <w:tcW w:type="dxa" w:w="2160"/>
           </w:tcPr>
           <w:p>
             <w:r>
-              <w:t>Create department; go to /admin/users FilterBar</w:t>
+              <w:t>Validation rejects values outside Executive/Management/Service</w:t>
             </w:r>
           </w:p>
         </w:tc>
         <w:tc>
           <w:tcPr>
-            <w:tcW w:type="dxa" w:w="1728"/>
-          </w:tcPr>
-          <w:p>
-            <w:r>
-              <w:t>New department appears as option in department filter</w:t>
-            </w:r>
-          </w:p>
-        </w:tc>
-        <w:tc>
-          <w:tcPr>
-            <w:tcW w:type="dxa" w:w="1728"/>
+            <w:tcW w:type="dxa" w:w="2160"/>
           </w:tcPr>
           <w:p>
             <w:r>
@@ -2351,7 +1731,7 @@
       <w:tr>
         <w:tc>
           <w:tcPr>
-            <w:tcW w:type="dxa" w:w="1728"/>
+            <w:tcW w:type="dxa" w:w="2160"/>
           </w:tcPr>
           <w:p>
             <w:r>
@@ -2361,37 +1741,27 @@
         </w:tc>
         <w:tc>
           <w:tcPr>
-            <w:tcW w:type="dxa" w:w="1728"/>
+            <w:tcW w:type="dxa" w:w="2160"/>
           </w:tcPr>
           <w:p>
             <w:r>
-              <w:t>Assign user to department</w:t>
+              <w:t>Blank Parent Department</w:t>
             </w:r>
           </w:p>
         </w:tc>
         <w:tc>
           <w:tcPr>
-            <w:tcW w:type="dxa" w:w="1728"/>
+            <w:tcW w:type="dxa" w:w="2160"/>
           </w:tcPr>
           <w:p>
             <w:r>
-              <w:t>In UserCard, select dept, position, primary; click Assign</w:t>
+              <w:t>Top-level departments can be saved without a parent</w:t>
             </w:r>
           </w:p>
         </w:tc>
         <w:tc>
           <w:tcPr>
-            <w:tcW w:type="dxa" w:w="1728"/>
-          </w:tcPr>
-          <w:p>
-            <w:r>
-              <w:t>Membership created; badge shown; MEMBER_ADD audit logged</w:t>
-            </w:r>
-          </w:p>
-        </w:tc>
-        <w:tc>
-          <w:tcPr>
-            <w:tcW w:type="dxa" w:w="1728"/>
+            <w:tcW w:type="dxa" w:w="2160"/>
           </w:tcPr>
           <w:p>
             <w:r>
@@ -2403,7 +1773,7 @@
       <w:tr>
         <w:tc>
           <w:tcPr>
-            <w:tcW w:type="dxa" w:w="1728"/>
+            <w:tcW w:type="dxa" w:w="2160"/>
           </w:tcPr>
           <w:p>
             <w:r>
@@ -2413,37 +1783,27 @@
         </w:tc>
         <w:tc>
           <w:tcPr>
-            <w:tcW w:type="dxa" w:w="1728"/>
+            <w:tcW w:type="dxa" w:w="2160"/>
           </w:tcPr>
           <w:p>
             <w:r>
-              <w:t>Remove user from department</w:t>
+              <w:t>Assign a Level as Parent</w:t>
             </w:r>
           </w:p>
         </w:tc>
         <w:tc>
           <w:tcPr>
-            <w:tcW w:type="dxa" w:w="1728"/>
+            <w:tcW w:type="dxa" w:w="2160"/>
           </w:tcPr>
           <w:p>
             <w:r>
-              <w:t>Click trash icon on membership badge</w:t>
+              <w:t>Departments can be nested under Management / Service / Executive</w:t>
             </w:r>
           </w:p>
         </w:tc>
         <w:tc>
           <w:tcPr>
-            <w:tcW w:type="dxa" w:w="1728"/>
-          </w:tcPr>
-          <w:p>
-            <w:r>
-              <w:t>Membership deleted; badge removed; MEMBER_REMOVE audit logged</w:t>
-            </w:r>
-          </w:p>
-        </w:tc>
-        <w:tc>
-          <w:tcPr>
-            <w:tcW w:type="dxa" w:w="1728"/>
+            <w:tcW w:type="dxa" w:w="2160"/>
           </w:tcPr>
           <w:p>
             <w:r>
@@ -2455,7 +1815,7 @@
       <w:tr>
         <w:tc>
           <w:tcPr>
-            <w:tcW w:type="dxa" w:w="1728"/>
+            <w:tcW w:type="dxa" w:w="2160"/>
           </w:tcPr>
           <w:p>
             <w:r>
@@ -2465,37 +1825,27 @@
         </w:tc>
         <w:tc>
           <w:tcPr>
-            <w:tcW w:type="dxa" w:w="1728"/>
+            <w:tcW w:type="dxa" w:w="2160"/>
           </w:tcPr>
           <w:p>
             <w:r>
-              <w:t>Filter users by department</w:t>
+              <w:t>Self-reference in Parent</w:t>
             </w:r>
           </w:p>
         </w:tc>
         <w:tc>
           <w:tcPr>
-            <w:tcW w:type="dxa" w:w="1728"/>
+            <w:tcW w:type="dxa" w:w="2160"/>
           </w:tcPr>
           <w:p>
             <w:r>
-              <w:t>Select department from filter in /admin/users</w:t>
+              <w:t>Setting a department’s parent to itself is blocked with circular-reference error</w:t>
             </w:r>
           </w:p>
         </w:tc>
         <w:tc>
           <w:tcPr>
-            <w:tcW w:type="dxa" w:w="1728"/>
-          </w:tcPr>
-          <w:p>
-            <w:r>
-              <w:t>Only users with memberships in that department shown; count updates</w:t>
-            </w:r>
-          </w:p>
-        </w:tc>
-        <w:tc>
-          <w:tcPr>
-            <w:tcW w:type="dxa" w:w="1728"/>
+            <w:tcW w:type="dxa" w:w="2160"/>
           </w:tcPr>
           <w:p>
             <w:r>
@@ -2507,7 +1857,7 @@
       <w:tr>
         <w:tc>
           <w:tcPr>
-            <w:tcW w:type="dxa" w:w="1728"/>
+            <w:tcW w:type="dxa" w:w="2160"/>
           </w:tcPr>
           <w:p>
             <w:r>
@@ -2517,37 +1867,27 @@
         </w:tc>
         <w:tc>
           <w:tcPr>
-            <w:tcW w:type="dxa" w:w="1728"/>
+            <w:tcW w:type="dxa" w:w="2160"/>
           </w:tcPr>
           <w:p>
             <w:r>
-              <w:t>Set department as primary membership</w:t>
+              <w:t>Circular reference</w:t>
             </w:r>
           </w:p>
         </w:tc>
         <w:tc>
           <w:tcPr>
-            <w:tcW w:type="dxa" w:w="1728"/>
+            <w:tcW w:type="dxa" w:w="2160"/>
           </w:tcPr>
           <w:p>
             <w:r>
-              <w:t>Assign membership with Primary checkbox</w:t>
+              <w:t>A → B → A cycles are detected and blocked</w:t>
             </w:r>
           </w:p>
         </w:tc>
         <w:tc>
           <w:tcPr>
-            <w:tcW w:type="dxa" w:w="1728"/>
-          </w:tcPr>
-          <w:p>
-            <w:r>
-              <w:t>Existing primary demoted; new membership marked primary; star shown</w:t>
-            </w:r>
-          </w:p>
-        </w:tc>
-        <w:tc>
-          <w:tcPr>
-            <w:tcW w:type="dxa" w:w="1728"/>
+            <w:tcW w:type="dxa" w:w="2160"/>
           </w:tcPr>
           <w:p>
             <w:r>
@@ -2559,7 +1899,7 @@
       <w:tr>
         <w:tc>
           <w:tcPr>
-            <w:tcW w:type="dxa" w:w="1728"/>
+            <w:tcW w:type="dxa" w:w="2160"/>
           </w:tcPr>
           <w:p>
             <w:r>
@@ -2569,37 +1909,27 @@
         </w:tc>
         <w:tc>
           <w:tcPr>
-            <w:tcW w:type="dxa" w:w="1728"/>
+            <w:tcW w:type="dxa" w:w="2160"/>
           </w:tcPr>
           <w:p>
             <w:r>
-              <w:t>Department-scoped dashboard</w:t>
+              <w:t>Edit existing department’s Level</w:t>
             </w:r>
           </w:p>
         </w:tc>
         <w:tc>
           <w:tcPr>
-            <w:tcW w:type="dxa" w:w="1728"/>
+            <w:tcW w:type="dxa" w:w="2160"/>
           </w:tcPr>
           <w:p>
             <w:r>
-              <w:t>Click department card; go to /dashboard?dept=id</w:t>
+              <w:t>Level field can be changed for non-Level records; updates successfully</w:t>
             </w:r>
           </w:p>
         </w:tc>
         <w:tc>
           <w:tcPr>
-            <w:tcW w:type="dxa" w:w="1728"/>
-          </w:tcPr>
-          <w:p>
-            <w:r>
-              <w:t>Dashboard header shows dept name; data scoped to department</w:t>
-            </w:r>
-          </w:p>
-        </w:tc>
-        <w:tc>
-          <w:tcPr>
-            <w:tcW w:type="dxa" w:w="1728"/>
+            <w:tcW w:type="dxa" w:w="2160"/>
           </w:tcPr>
           <w:p>
             <w:r>
@@ -2611,7 +1941,7 @@
       <w:tr>
         <w:tc>
           <w:tcPr>
-            <w:tcW w:type="dxa" w:w="1728"/>
+            <w:tcW w:type="dxa" w:w="2160"/>
           </w:tcPr>
           <w:p>
             <w:r>
@@ -2621,89 +1951,27 @@
         </w:tc>
         <w:tc>
           <w:tcPr>
-            <w:tcW w:type="dxa" w:w="1728"/>
+            <w:tcW w:type="dxa" w:w="2160"/>
           </w:tcPr>
           <w:p>
             <w:r>
-              <w:t>Delete a department</w:t>
+              <w:t>Delete department with no children</w:t>
             </w:r>
           </w:p>
         </w:tc>
         <w:tc>
           <w:tcPr>
-            <w:tcW w:type="dxa" w:w="1728"/>
+            <w:tcW w:type="dxa" w:w="2160"/>
           </w:tcPr>
           <w:p>
             <w:r>
-              <w:t>Delete via database or admin action</w:t>
+              <w:t>Leaf-node departments are deletable</w:t>
             </w:r>
           </w:p>
         </w:tc>
         <w:tc>
           <w:tcPr>
-            <w:tcW w:type="dxa" w:w="1728"/>
-          </w:tcPr>
-          <w:p>
-            <w:r>
-              <w:t>Children parentId set to NULL (onDelete: SetNull); memberships cascade-deleted</w:t>
-            </w:r>
-          </w:p>
-        </w:tc>
-        <w:tc>
-          <w:tcPr>
-            <w:tcW w:type="dxa" w:w="1728"/>
-          </w:tcPr>
-          <w:p>
-            <w:r>
-              <w:t>Untested</w:t>
-            </w:r>
-          </w:p>
-        </w:tc>
-      </w:tr>
-      <w:tr>
-        <w:tc>
-          <w:tcPr>
-            <w:tcW w:type="dxa" w:w="1728"/>
-          </w:tcPr>
-          <w:p>
-            <w:r>
-              <w:t>TC-015</w:t>
-            </w:r>
-          </w:p>
-        </w:tc>
-        <w:tc>
-          <w:tcPr>
-            <w:tcW w:type="dxa" w:w="1728"/>
-          </w:tcPr>
-          <w:p>
-            <w:r>
-              <w:t>View department in /departments page</w:t>
-            </w:r>
-          </w:p>
-        </w:tc>
-        <w:tc>
-          <w:tcPr>
-            <w:tcW w:type="dxa" w:w="1728"/>
-          </w:tcPr>
-          <w:p>
-            <w:r>
-              <w:t>Navigate to /departments</w:t>
-            </w:r>
-          </w:p>
-        </w:tc>
-        <w:tc>
-          <w:tcPr>
-            <w:tcW w:type="dxa" w:w="1728"/>
-          </w:tcPr>
-          <w:p>
-            <w:r>
-              <w:t>Parent depts in main grid; child depts in sub-department grid; member/client counts</w:t>
-            </w:r>
-          </w:p>
-        </w:tc>
-        <w:tc>
-          <w:tcPr>
-            <w:tcW w:type="dxa" w:w="1728"/>
+            <w:tcW w:type="dxa" w:w="2160"/>
           </w:tcPr>
           <w:p>
             <w:r>
@@ -2715,47 +1983,37 @@
       <w:tr>
         <w:tc>
           <w:tcPr>
-            <w:tcW w:type="dxa" w:w="1728"/>
+            <w:tcW w:type="dxa" w:w="2160"/>
           </w:tcPr>
           <w:p>
             <w:r>
-              <w:t>TC-016</w:t>
+              <w:t>TC-015</w:t>
             </w:r>
           </w:p>
         </w:tc>
         <w:tc>
           <w:tcPr>
-            <w:tcW w:type="dxa" w:w="1728"/>
+            <w:tcW w:type="dxa" w:w="2160"/>
           </w:tcPr>
           <w:p>
             <w:r>
-              <w:t>Empty state when no departments exist</w:t>
+              <w:t>Delete department with children</w:t>
             </w:r>
           </w:p>
         </w:tc>
         <w:tc>
           <w:tcPr>
-            <w:tcW w:type="dxa" w:w="1728"/>
+            <w:tcW w:type="dxa" w:w="2160"/>
           </w:tcPr>
           <w:p>
             <w:r>
-              <w:t>Delete all departments; visit /departments</w:t>
+              <w:t>Deletion is blocked with a warning to reassign or deactivate children</w:t>
             </w:r>
           </w:p>
         </w:tc>
         <w:tc>
           <w:tcPr>
-            <w:tcW w:type="dxa" w:w="1728"/>
-          </w:tcPr>
-          <w:p>
-            <w:r>
-              <w:t>Empty state with Building icon and link to Admin Panel</w:t>
-            </w:r>
-          </w:p>
-        </w:tc>
-        <w:tc>
-          <w:tcPr>
-            <w:tcW w:type="dxa" w:w="1728"/>
+            <w:tcW w:type="dxa" w:w="2160"/>
           </w:tcPr>
           <w:p>
             <w:r>
@@ -2767,47 +2025,37 @@
       <w:tr>
         <w:tc>
           <w:tcPr>
-            <w:tcW w:type="dxa" w:w="1728"/>
+            <w:tcW w:type="dxa" w:w="2160"/>
           </w:tcPr>
           <w:p>
             <w:r>
-              <w:t>TC-017</w:t>
+              <w:t>TC-016</w:t>
             </w:r>
           </w:p>
         </w:tc>
         <w:tc>
           <w:tcPr>
-            <w:tcW w:type="dxa" w:w="1728"/>
+            <w:tcW w:type="dxa" w:w="2160"/>
           </w:tcPr>
           <w:p>
             <w:r>
-              <w:t>Sort order respected in lists</w:t>
+              <w:t>Delete a default Level record</w:t>
             </w:r>
           </w:p>
         </w:tc>
         <w:tc>
           <w:tcPr>
-            <w:tcW w:type="dxa" w:w="1728"/>
+            <w:tcW w:type="dxa" w:w="2160"/>
           </w:tcPr>
           <w:p>
             <w:r>
-              <w:t>Set different sortOrder values; view department lists</w:t>
+              <w:t>Executive / Management / Service cannot be deleted; protected-record error shown</w:t>
             </w:r>
           </w:p>
         </w:tc>
         <w:tc>
           <w:tcPr>
-            <w:tcW w:type="dxa" w:w="1728"/>
-          </w:tcPr>
-          <w:p>
-            <w:r>
-              <w:t>Departments display in ascending sortOrder</w:t>
-            </w:r>
-          </w:p>
-        </w:tc>
-        <w:tc>
-          <w:tcPr>
-            <w:tcW w:type="dxa" w:w="1728"/>
+            <w:tcW w:type="dxa" w:w="2160"/>
           </w:tcPr>
           <w:p>
             <w:r>
@@ -2819,47 +2067,37 @@
       <w:tr>
         <w:tc>
           <w:tcPr>
-            <w:tcW w:type="dxa" w:w="1728"/>
+            <w:tcW w:type="dxa" w:w="2160"/>
           </w:tcPr>
           <w:p>
             <w:r>
-              <w:t>TC-018</w:t>
+              <w:t>TC-017</w:t>
             </w:r>
           </w:p>
         </w:tc>
         <w:tc>
           <w:tcPr>
-            <w:tcW w:type="dxa" w:w="1728"/>
+            <w:tcW w:type="dxa" w:w="2160"/>
           </w:tcPr>
           <w:p>
             <w:r>
-              <w:t>Roster filter by department</w:t>
+              <w:t>Change Level of default Level record</w:t>
             </w:r>
           </w:p>
         </w:tc>
         <w:tc>
           <w:tcPr>
-            <w:tcW w:type="dxa" w:w="1728"/>
+            <w:tcW w:type="dxa" w:w="2160"/>
           </w:tcPr>
           <w:p>
             <w:r>
-              <w:t>Go to /vas; select department filter</w:t>
+              <w:t>Cannot edit the Level field of a system Level record; protected-field error shown</w:t>
             </w:r>
           </w:p>
         </w:tc>
         <w:tc>
           <w:tcPr>
-            <w:tcW w:type="dxa" w:w="1728"/>
-          </w:tcPr>
-          <w:p>
-            <w:r>
-              <w:t>Only VAs in selected department shown; count updates</w:t>
-            </w:r>
-          </w:p>
-        </w:tc>
-        <w:tc>
-          <w:tcPr>
-            <w:tcW w:type="dxa" w:w="1728"/>
+            <w:tcW w:type="dxa" w:w="2160"/>
           </w:tcPr>
           <w:p>
             <w:r>
@@ -2871,47 +2109,37 @@
       <w:tr>
         <w:tc>
           <w:tcPr>
-            <w:tcW w:type="dxa" w:w="1728"/>
+            <w:tcW w:type="dxa" w:w="2160"/>
           </w:tcPr>
           <w:p>
             <w:r>
-              <w:t>TC-019</w:t>
+              <w:t>TC-018</w:t>
             </w:r>
           </w:p>
         </w:tc>
         <w:tc>
           <w:tcPr>
-            <w:tcW w:type="dxa" w:w="1728"/>
+            <w:tcW w:type="dxa" w:w="2160"/>
           </w:tcPr>
           <w:p>
             <w:r>
-              <w:t>Audit log captures department changes</w:t>
+              <w:t>Service-level VA eligibility</w:t>
             </w:r>
           </w:p>
         </w:tc>
         <w:tc>
           <w:tcPr>
-            <w:tcW w:type="dxa" w:w="1728"/>
+            <w:tcW w:type="dxa" w:w="2160"/>
           </w:tcPr>
           <w:p>
             <w:r>
-              <w:t>Create/edit/toggle department; go to /admin/audit</w:t>
+              <w:t>Departments under Service are flagged and available for VA-client assignment workflows</w:t>
             </w:r>
           </w:p>
         </w:tc>
         <w:tc>
           <w:tcPr>
-            <w:tcW w:type="dxa" w:w="1728"/>
-          </w:tcPr>
-          <w:p>
-            <w:r>
-              <w:t>Events shown with action type, actor, before/after values, department metadata</w:t>
-            </w:r>
-          </w:p>
-        </w:tc>
-        <w:tc>
-          <w:tcPr>
-            <w:tcW w:type="dxa" w:w="1728"/>
+            <w:tcW w:type="dxa" w:w="2160"/>
           </w:tcPr>
           <w:p>
             <w:r>
@@ -2923,7 +2151,49 @@
       <w:tr>
         <w:tc>
           <w:tcPr>
-            <w:tcW w:type="dxa" w:w="1728"/>
+            <w:tcW w:type="dxa" w:w="2160"/>
+          </w:tcPr>
+          <w:p>
+            <w:r>
+              <w:t>TC-019</w:t>
+            </w:r>
+          </w:p>
+        </w:tc>
+        <w:tc>
+          <w:tcPr>
+            <w:tcW w:type="dxa" w:w="2160"/>
+          </w:tcPr>
+          <w:p>
+            <w:r>
+              <w:t>Department Name character limit (&gt;100)</w:t>
+            </w:r>
+          </w:p>
+        </w:tc>
+        <w:tc>
+          <w:tcPr>
+            <w:tcW w:type="dxa" w:w="2160"/>
+          </w:tcPr>
+          <w:p>
+            <w:r>
+              <w:t>Names over 100 characters are rejected with max-length error</w:t>
+            </w:r>
+          </w:p>
+        </w:tc>
+        <w:tc>
+          <w:tcPr>
+            <w:tcW w:type="dxa" w:w="2160"/>
+          </w:tcPr>
+          <w:p>
+            <w:r>
+              <w:t>Pass</w:t>
+            </w:r>
+          </w:p>
+        </w:tc>
+      </w:tr>
+      <w:tr>
+        <w:tc>
+          <w:tcPr>
+            <w:tcW w:type="dxa" w:w="2160"/>
           </w:tcPr>
           <w:p>
             <w:r>
@@ -2933,37 +2203,1218 @@
         </w:tc>
         <w:tc>
           <w:tcPr>
-            <w:tcW w:type="dxa" w:w="1728"/>
+            <w:tcW w:type="dxa" w:w="2160"/>
           </w:tcPr>
           <w:p>
             <w:r>
-              <w:t>Department membership in audit log</w:t>
+              <w:t>Short Name character limit (&gt;50)</w:t>
             </w:r>
           </w:p>
         </w:tc>
         <w:tc>
           <w:tcPr>
-            <w:tcW w:type="dxa" w:w="1728"/>
+            <w:tcW w:type="dxa" w:w="2160"/>
           </w:tcPr>
           <w:p>
             <w:r>
-              <w:t>Add/remove membership; go to /admin/audit</w:t>
+              <w:t>Short names over 50 characters are rejected with max-length error</w:t>
             </w:r>
           </w:p>
         </w:tc>
         <w:tc>
           <w:tcPr>
-            <w:tcW w:type="dxa" w:w="1728"/>
+            <w:tcW w:type="dxa" w:w="2160"/>
           </w:tcPr>
           <w:p>
             <w:r>
-              <w:t>MEMBER_ADD/MEMBER_REMOVE events with department name, user email</w:t>
+              <w:t>Pass</w:t>
+            </w:r>
+          </w:p>
+        </w:tc>
+      </w:tr>
+      <w:tr>
+        <w:tc>
+          <w:tcPr>
+            <w:tcW w:type="dxa" w:w="2160"/>
+          </w:tcPr>
+          <w:p>
+            <w:r>
+              <w:t>TC-021</w:t>
             </w:r>
           </w:p>
         </w:tc>
         <w:tc>
           <w:tcPr>
-            <w:tcW w:type="dxa" w:w="1728"/>
+            <w:tcW w:type="dxa" w:w="2160"/>
+          </w:tcPr>
+          <w:p>
+            <w:r>
+              <w:t>Acronym character limit (&gt;6)</w:t>
+            </w:r>
+          </w:p>
+        </w:tc>
+        <w:tc>
+          <w:tcPr>
+            <w:tcW w:type="dxa" w:w="2160"/>
+          </w:tcPr>
+          <w:p>
+            <w:r>
+              <w:t>Acronyms over 6 characters are rejected with max-length error</w:t>
+            </w:r>
+          </w:p>
+        </w:tc>
+        <w:tc>
+          <w:tcPr>
+            <w:tcW w:type="dxa" w:w="2160"/>
+          </w:tcPr>
+          <w:p>
+            <w:r>
+              <w:t>Pass</w:t>
+            </w:r>
+          </w:p>
+        </w:tc>
+      </w:tr>
+      <w:tr>
+        <w:tc>
+          <w:tcPr>
+            <w:tcW w:type="dxa" w:w="2160"/>
+          </w:tcPr>
+          <w:p>
+            <w:r>
+              <w:t>TC-022</w:t>
+            </w:r>
+          </w:p>
+        </w:tc>
+        <w:tc>
+          <w:tcPr>
+            <w:tcW w:type="dxa" w:w="2160"/>
+          </w:tcPr>
+          <w:p>
+            <w:r>
+              <w:t>Whitespace trimming</w:t>
+            </w:r>
+          </w:p>
+        </w:tc>
+        <w:tc>
+          <w:tcPr>
+            <w:tcW w:type="dxa" w:w="2160"/>
+          </w:tcPr>
+          <w:p>
+            <w:r>
+              <w:t>Leading/trailing whitespace is trimmed automatically before save</w:t>
+            </w:r>
+          </w:p>
+        </w:tc>
+        <w:tc>
+          <w:tcPr>
+            <w:tcW w:type="dxa" w:w="2160"/>
+          </w:tcPr>
+          <w:p>
+            <w:r>
+              <w:t>Pass</w:t>
+            </w:r>
+          </w:p>
+        </w:tc>
+      </w:tr>
+      <w:tr>
+        <w:tc>
+          <w:tcPr>
+            <w:tcW w:type="dxa" w:w="2160"/>
+          </w:tcPr>
+          <w:p>
+            <w:r>
+              <w:t>TC-023</w:t>
+            </w:r>
+          </w:p>
+        </w:tc>
+        <w:tc>
+          <w:tcPr>
+            <w:tcW w:type="dxa" w:w="2160"/>
+          </w:tcPr>
+          <w:p>
+            <w:r>
+              <w:t>Search/filter by Level</w:t>
+            </w:r>
+          </w:p>
+        </w:tc>
+        <w:tc>
+          <w:tcPr>
+            <w:tcW w:type="dxa" w:w="2160"/>
+          </w:tcPr>
+          <w:p>
+            <w:r>
+              <w:t>Departments can be filtered by Level in the admin interface</w:t>
+            </w:r>
+          </w:p>
+        </w:tc>
+        <w:tc>
+          <w:tcPr>
+            <w:tcW w:type="dxa" w:w="2160"/>
+          </w:tcPr>
+          <w:p>
+            <w:r>
+              <w:t>Pass</w:t>
+            </w:r>
+          </w:p>
+        </w:tc>
+      </w:tr>
+      <w:tr>
+        <w:tc>
+          <w:tcPr>
+            <w:tcW w:type="dxa" w:w="2160"/>
+          </w:tcPr>
+          <w:p>
+            <w:r>
+              <w:t>TC-024</w:t>
+            </w:r>
+          </w:p>
+        </w:tc>
+        <w:tc>
+          <w:tcPr>
+            <w:tcW w:type="dxa" w:w="2160"/>
+          </w:tcPr>
+          <w:p>
+            <w:r>
+              <w:t>Org chart / hierarchy display</w:t>
+            </w:r>
+          </w:p>
+        </w:tc>
+        <w:tc>
+          <w:tcPr>
+            <w:tcW w:type="dxa" w:w="2160"/>
+          </w:tcPr>
+          <w:p>
+            <w:r>
+              <w:t>Departments render correctly under their parents in /departments and /admin/departments</w:t>
+            </w:r>
+          </w:p>
+        </w:tc>
+        <w:tc>
+          <w:tcPr>
+            <w:tcW w:type="dxa" w:w="2160"/>
+          </w:tcPr>
+          <w:p>
+            <w:r>
+              <w:t>Pass</w:t>
+            </w:r>
+          </w:p>
+        </w:tc>
+      </w:tr>
+      <w:tr>
+        <w:tc>
+          <w:tcPr>
+            <w:tcW w:type="dxa" w:w="2160"/>
+          </w:tcPr>
+          <w:p>
+            <w:r>
+              <w:t>TC-025</w:t>
+            </w:r>
+          </w:p>
+        </w:tc>
+        <w:tc>
+          <w:tcPr>
+            <w:tcW w:type="dxa" w:w="2160"/>
+          </w:tcPr>
+          <w:p>
+            <w:r>
+              <w:t>Parent Department referencing inactive record</w:t>
+            </w:r>
+          </w:p>
+        </w:tc>
+        <w:tc>
+          <w:tcPr>
+            <w:tcW w:type="dxa" w:w="2160"/>
+          </w:tcPr>
+          <w:p>
+            <w:r>
+              <w:t>Cannot set parent to inactive/deleted department; validation rejects</w:t>
+            </w:r>
+          </w:p>
+        </w:tc>
+        <w:tc>
+          <w:tcPr>
+            <w:tcW w:type="dxa" w:w="2160"/>
+          </w:tcPr>
+          <w:p>
+            <w:r>
+              <w:t>Pass</w:t>
+            </w:r>
+          </w:p>
+        </w:tc>
+      </w:tr>
+    </w:tbl>
+    <w:p>
+      <w:pPr>
+        <w:pStyle w:val="Heading2"/>
+      </w:pPr>
+      <w:r>
+        <w:t>Test Cases — Date Created</w:t>
+      </w:r>
+    </w:p>
+    <w:tbl>
+      <w:tblPr>
+        <w:tblStyle w:val="TableGrid"/>
+        <w:tblW w:type="auto" w:w="0"/>
+        <w:tblLook w:firstColumn="1" w:firstRow="1" w:lastColumn="0" w:lastRow="0" w:noHBand="0" w:noVBand="1" w:val="04A0"/>
+      </w:tblPr>
+      <w:tblGrid>
+        <w:gridCol w:w="2160"/>
+        <w:gridCol w:w="2160"/>
+        <w:gridCol w:w="2160"/>
+        <w:gridCol w:w="2160"/>
+      </w:tblGrid>
+      <w:tr>
+        <w:tc>
+          <w:tcPr>
+            <w:tcW w:type="dxa" w:w="2160"/>
+          </w:tcPr>
+          <w:p>
+            <w:r>
+              <w:rPr>
+                <w:b/>
+              </w:rPr>
+              <w:t>Test ID</w:t>
+            </w:r>
+          </w:p>
+        </w:tc>
+        <w:tc>
+          <w:tcPr>
+            <w:tcW w:type="dxa" w:w="2160"/>
+          </w:tcPr>
+          <w:p>
+            <w:r>
+              <w:rPr>
+                <w:b/>
+              </w:rPr>
+              <w:t>Test Scenario</w:t>
+            </w:r>
+          </w:p>
+        </w:tc>
+        <w:tc>
+          <w:tcPr>
+            <w:tcW w:type="dxa" w:w="2160"/>
+          </w:tcPr>
+          <w:p>
+            <w:r>
+              <w:rPr>
+                <w:b/>
+              </w:rPr>
+              <w:t>Expected Result</w:t>
+            </w:r>
+          </w:p>
+        </w:tc>
+        <w:tc>
+          <w:tcPr>
+            <w:tcW w:type="dxa" w:w="2160"/>
+          </w:tcPr>
+          <w:p>
+            <w:r>
+              <w:rPr>
+                <w:b/>
+              </w:rPr>
+              <w:t>Status</w:t>
+            </w:r>
+          </w:p>
+        </w:tc>
+      </w:tr>
+      <w:tr>
+        <w:tc>
+          <w:tcPr>
+            <w:tcW w:type="dxa" w:w="2160"/>
+          </w:tcPr>
+          <w:p>
+            <w:r>
+              <w:t>TC-026</w:t>
+            </w:r>
+          </w:p>
+        </w:tc>
+        <w:tc>
+          <w:tcPr>
+            <w:tcW w:type="dxa" w:w="2160"/>
+          </w:tcPr>
+          <w:p>
+            <w:r>
+              <w:t>Date Created auto-population</w:t>
+            </w:r>
+          </w:p>
+        </w:tc>
+        <w:tc>
+          <w:tcPr>
+            <w:tcW w:type="dxa" w:w="2160"/>
+          </w:tcPr>
+          <w:p>
+            <w:r>
+              <w:t>Date Created is automatically set to current timestamp on creation</w:t>
+            </w:r>
+          </w:p>
+        </w:tc>
+        <w:tc>
+          <w:tcPr>
+            <w:tcW w:type="dxa" w:w="2160"/>
+          </w:tcPr>
+          <w:p>
+            <w:r>
+              <w:t>Pass</w:t>
+            </w:r>
+          </w:p>
+        </w:tc>
+      </w:tr>
+      <w:tr>
+        <w:tc>
+          <w:tcPr>
+            <w:tcW w:type="dxa" w:w="2160"/>
+          </w:tcPr>
+          <w:p>
+            <w:r>
+              <w:t>TC-027</w:t>
+            </w:r>
+          </w:p>
+        </w:tc>
+        <w:tc>
+          <w:tcPr>
+            <w:tcW w:type="dxa" w:w="2160"/>
+          </w:tcPr>
+          <w:p>
+            <w:r>
+              <w:t>Cannot manually edit Date Created</w:t>
+            </w:r>
+          </w:p>
+        </w:tc>
+        <w:tc>
+          <w:tcPr>
+            <w:tcW w:type="dxa" w:w="2160"/>
+          </w:tcPr>
+          <w:p>
+            <w:r>
+              <w:t>Date Created field is read-only and not exposed for editing</w:t>
+            </w:r>
+          </w:p>
+        </w:tc>
+        <w:tc>
+          <w:tcPr>
+            <w:tcW w:type="dxa" w:w="2160"/>
+          </w:tcPr>
+          <w:p>
+            <w:r>
+              <w:t>Pass</w:t>
+            </w:r>
+          </w:p>
+        </w:tc>
+      </w:tr>
+      <w:tr>
+        <w:tc>
+          <w:tcPr>
+            <w:tcW w:type="dxa" w:w="2160"/>
+          </w:tcPr>
+          <w:p>
+            <w:r>
+              <w:t>TC-028</w:t>
+            </w:r>
+          </w:p>
+        </w:tc>
+        <w:tc>
+          <w:tcPr>
+            <w:tcW w:type="dxa" w:w="2160"/>
+          </w:tcPr>
+          <w:p>
+            <w:r>
+              <w:t>Date Created unchanged by later edits</w:t>
+            </w:r>
+          </w:p>
+        </w:tc>
+        <w:tc>
+          <w:tcPr>
+            <w:tcW w:type="dxa" w:w="2160"/>
+          </w:tcPr>
+          <w:p>
+            <w:r>
+              <w:t>Editing other fields (e.g., Short Name) does not change Date Created</w:t>
+            </w:r>
+          </w:p>
+        </w:tc>
+        <w:tc>
+          <w:tcPr>
+            <w:tcW w:type="dxa" w:w="2160"/>
+          </w:tcPr>
+          <w:p>
+            <w:r>
+              <w:t>Pass</w:t>
+            </w:r>
+          </w:p>
+        </w:tc>
+      </w:tr>
+      <w:tr>
+        <w:tc>
+          <w:tcPr>
+            <w:tcW w:type="dxa" w:w="2160"/>
+          </w:tcPr>
+          <w:p>
+            <w:r>
+              <w:t>TC-029</w:t>
+            </w:r>
+          </w:p>
+        </w:tc>
+        <w:tc>
+          <w:tcPr>
+            <w:tcW w:type="dxa" w:w="2160"/>
+          </w:tcPr>
+          <w:p>
+            <w:r>
+              <w:t>Sort/filter by Date Created</w:t>
+            </w:r>
+          </w:p>
+        </w:tc>
+        <w:tc>
+          <w:tcPr>
+            <w:tcW w:type="dxa" w:w="2160"/>
+          </w:tcPr>
+          <w:p>
+            <w:r>
+              <w:t>Lists can be sorted by Date Created ascending or descending</w:t>
+            </w:r>
+          </w:p>
+        </w:tc>
+        <w:tc>
+          <w:tcPr>
+            <w:tcW w:type="dxa" w:w="2160"/>
+          </w:tcPr>
+          <w:p>
+            <w:r>
+              <w:t>Pass</w:t>
+            </w:r>
+          </w:p>
+        </w:tc>
+      </w:tr>
+    </w:tbl>
+    <w:p>
+      <w:pPr>
+        <w:pStyle w:val="Heading2"/>
+      </w:pPr>
+      <w:r>
+        <w:t>Test Cases — Merge Operation</w:t>
+      </w:r>
+    </w:p>
+    <w:tbl>
+      <w:tblPr>
+        <w:tblStyle w:val="TableGrid"/>
+        <w:tblW w:type="auto" w:w="0"/>
+        <w:tblLook w:firstColumn="1" w:firstRow="1" w:lastColumn="0" w:lastRow="0" w:noHBand="0" w:noVBand="1" w:val="04A0"/>
+      </w:tblPr>
+      <w:tblGrid>
+        <w:gridCol w:w="2160"/>
+        <w:gridCol w:w="2160"/>
+        <w:gridCol w:w="2160"/>
+        <w:gridCol w:w="2160"/>
+      </w:tblGrid>
+      <w:tr>
+        <w:tc>
+          <w:tcPr>
+            <w:tcW w:type="dxa" w:w="2160"/>
+          </w:tcPr>
+          <w:p>
+            <w:r>
+              <w:rPr>
+                <w:b/>
+              </w:rPr>
+              <w:t>Test ID</w:t>
+            </w:r>
+          </w:p>
+        </w:tc>
+        <w:tc>
+          <w:tcPr>
+            <w:tcW w:type="dxa" w:w="2160"/>
+          </w:tcPr>
+          <w:p>
+            <w:r>
+              <w:rPr>
+                <w:b/>
+              </w:rPr>
+              <w:t>Test Scenario</w:t>
+            </w:r>
+          </w:p>
+        </w:tc>
+        <w:tc>
+          <w:tcPr>
+            <w:tcW w:type="dxa" w:w="2160"/>
+          </w:tcPr>
+          <w:p>
+            <w:r>
+              <w:rPr>
+                <w:b/>
+              </w:rPr>
+              <w:t>Expected Result</w:t>
+            </w:r>
+          </w:p>
+        </w:tc>
+        <w:tc>
+          <w:tcPr>
+            <w:tcW w:type="dxa" w:w="2160"/>
+          </w:tcPr>
+          <w:p>
+            <w:r>
+              <w:rPr>
+                <w:b/>
+              </w:rPr>
+              <w:t>Status</w:t>
+            </w:r>
+          </w:p>
+        </w:tc>
+      </w:tr>
+      <w:tr>
+        <w:tc>
+          <w:tcPr>
+            <w:tcW w:type="dxa" w:w="2160"/>
+          </w:tcPr>
+          <w:p>
+            <w:r>
+              <w:t>TC-030</w:t>
+            </w:r>
+          </w:p>
+        </w:tc>
+        <w:tc>
+          <w:tcPr>
+            <w:tcW w:type="dxa" w:w="2160"/>
+          </w:tcPr>
+          <w:p>
+            <w:r>
+              <w:t>Merge two same-Level departments</w:t>
+            </w:r>
+          </w:p>
+        </w:tc>
+        <w:tc>
+          <w:tcPr>
+            <w:tcW w:type="dxa" w:w="2160"/>
+          </w:tcPr>
+          <w:p>
+            <w:r>
+              <w:t>Source’s Status becomes Merged, Merged Into = Target, source hidden from active lists</w:t>
+            </w:r>
+          </w:p>
+        </w:tc>
+        <w:tc>
+          <w:tcPr>
+            <w:tcW w:type="dxa" w:w="2160"/>
+          </w:tcPr>
+          <w:p>
+            <w:r>
+              <w:t>Pass</w:t>
+            </w:r>
+          </w:p>
+        </w:tc>
+      </w:tr>
+      <w:tr>
+        <w:tc>
+          <w:tcPr>
+            <w:tcW w:type="dxa" w:w="2160"/>
+          </w:tcPr>
+          <w:p>
+            <w:r>
+              <w:t>TC-031</w:t>
+            </w:r>
+          </w:p>
+        </w:tc>
+        <w:tc>
+          <w:tcPr>
+            <w:tcW w:type="dxa" w:w="2160"/>
+          </w:tcPr>
+          <w:p>
+            <w:r>
+              <w:t>Cross-Level merge</w:t>
+            </w:r>
+          </w:p>
+        </w:tc>
+        <w:tc>
+          <w:tcPr>
+            <w:tcW w:type="dxa" w:w="2160"/>
+          </w:tcPr>
+          <w:p>
+            <w:r>
+              <w:t>Cross-Level merges (e.g., Service into Management) are rejected with a clear error</w:t>
+            </w:r>
+          </w:p>
+        </w:tc>
+        <w:tc>
+          <w:tcPr>
+            <w:tcW w:type="dxa" w:w="2160"/>
+          </w:tcPr>
+          <w:p>
+            <w:r>
+              <w:t>Pass</w:t>
+            </w:r>
+          </w:p>
+        </w:tc>
+      </w:tr>
+      <w:tr>
+        <w:tc>
+          <w:tcPr>
+            <w:tcW w:type="dxa" w:w="2160"/>
+          </w:tcPr>
+          <w:p>
+            <w:r>
+              <w:t>TC-032</w:t>
+            </w:r>
+          </w:p>
+        </w:tc>
+        <w:tc>
+          <w:tcPr>
+            <w:tcW w:type="dxa" w:w="2160"/>
+          </w:tcPr>
+          <w:p>
+            <w:r>
+              <w:t>Merge with existing children</w:t>
+            </w:r>
+          </w:p>
+        </w:tc>
+        <w:tc>
+          <w:tcPr>
+            <w:tcW w:type="dxa" w:w="2160"/>
+          </w:tcPr>
+          <w:p>
+            <w:r>
+              <w:t>Sub-departments are automatically reassigned to the target during merge</w:t>
+            </w:r>
+          </w:p>
+        </w:tc>
+        <w:tc>
+          <w:tcPr>
+            <w:tcW w:type="dxa" w:w="2160"/>
+          </w:tcPr>
+          <w:p>
+            <w:r>
+              <w:t>Pass</w:t>
+            </w:r>
+          </w:p>
+        </w:tc>
+      </w:tr>
+      <w:tr>
+        <w:tc>
+          <w:tcPr>
+            <w:tcW w:type="dxa" w:w="2160"/>
+          </w:tcPr>
+          <w:p>
+            <w:r>
+              <w:t>TC-033</w:t>
+            </w:r>
+          </w:p>
+        </w:tc>
+        <w:tc>
+          <w:tcPr>
+            <w:tcW w:type="dxa" w:w="2160"/>
+          </w:tcPr>
+          <w:p>
+            <w:r>
+              <w:t>Merge with active VA/client assignments</w:t>
+            </w:r>
+          </w:p>
+        </w:tc>
+        <w:tc>
+          <w:tcPr>
+            <w:tcW w:type="dxa" w:w="2160"/>
+          </w:tcPr>
+          <w:p>
+            <w:r>
+              <w:t>All memberships, clients, and assignments move to the target during merge</w:t>
+            </w:r>
+          </w:p>
+        </w:tc>
+        <w:tc>
+          <w:tcPr>
+            <w:tcW w:type="dxa" w:w="2160"/>
+          </w:tcPr>
+          <w:p>
+            <w:r>
+              <w:t>Pass</w:t>
+            </w:r>
+          </w:p>
+        </w:tc>
+      </w:tr>
+      <w:tr>
+        <w:tc>
+          <w:tcPr>
+            <w:tcW w:type="dxa" w:w="2160"/>
+          </w:tcPr>
+          <w:p>
+            <w:r>
+              <w:t>TC-034</w:t>
+            </w:r>
+          </w:p>
+        </w:tc>
+        <w:tc>
+          <w:tcPr>
+            <w:tcW w:type="dxa" w:w="2160"/>
+          </w:tcPr>
+          <w:p>
+            <w:r>
+              <w:t>Merged dept excluded from Parent dropdown</w:t>
+            </w:r>
+          </w:p>
+        </w:tc>
+        <w:tc>
+          <w:tcPr>
+            <w:tcW w:type="dxa" w:w="2160"/>
+          </w:tcPr>
+          <w:p>
+            <w:r>
+              <w:t>Merged departments do not appear as selectable parents for new departments</w:t>
+            </w:r>
+          </w:p>
+        </w:tc>
+        <w:tc>
+          <w:tcPr>
+            <w:tcW w:type="dxa" w:w="2160"/>
+          </w:tcPr>
+          <w:p>
+            <w:r>
+              <w:t>Pass</w:t>
+            </w:r>
+          </w:p>
+        </w:tc>
+      </w:tr>
+      <w:tr>
+        <w:tc>
+          <w:tcPr>
+            <w:tcW w:type="dxa" w:w="2160"/>
+          </w:tcPr>
+          <w:p>
+            <w:r>
+              <w:t>TC-035</w:t>
+            </w:r>
+          </w:p>
+        </w:tc>
+        <w:tc>
+          <w:tcPr>
+            <w:tcW w:type="dxa" w:w="2160"/>
+          </w:tcPr>
+          <w:p>
+            <w:r>
+              <w:t>Merged dept remains in audit logs</w:t>
+            </w:r>
+          </w:p>
+        </w:tc>
+        <w:tc>
+          <w:tcPr>
+            <w:tcW w:type="dxa" w:w="2160"/>
+          </w:tcPr>
+          <w:p>
+            <w:r>
+              <w:t>Historical reports and audit logs still show the merged department with correct Merged Into reference</w:t>
+            </w:r>
+          </w:p>
+        </w:tc>
+        <w:tc>
+          <w:tcPr>
+            <w:tcW w:type="dxa" w:w="2160"/>
+          </w:tcPr>
+          <w:p>
+            <w:r>
+              <w:t>Pass</w:t>
+            </w:r>
+          </w:p>
+        </w:tc>
+      </w:tr>
+      <w:tr>
+        <w:tc>
+          <w:tcPr>
+            <w:tcW w:type="dxa" w:w="2160"/>
+          </w:tcPr>
+          <w:p>
+            <w:r>
+              <w:t>TC-036</w:t>
+            </w:r>
+          </w:p>
+        </w:tc>
+        <w:tc>
+          <w:tcPr>
+            <w:tcW w:type="dxa" w:w="2160"/>
+          </w:tcPr>
+          <w:p>
+            <w:r>
+              <w:t>Re-merge already-merged dept</w:t>
+            </w:r>
+          </w:p>
+        </w:tc>
+        <w:tc>
+          <w:tcPr>
+            <w:tcW w:type="dxa" w:w="2160"/>
+          </w:tcPr>
+          <w:p>
+            <w:r>
+              <w:t>Cannot re-merge a department already in Merged status; error displayed</w:t>
+            </w:r>
+          </w:p>
+        </w:tc>
+        <w:tc>
+          <w:tcPr>
+            <w:tcW w:type="dxa" w:w="2160"/>
+          </w:tcPr>
+          <w:p>
+            <w:r>
+              <w:t>Pass</w:t>
+            </w:r>
+          </w:p>
+        </w:tc>
+      </w:tr>
+    </w:tbl>
+    <w:p>
+      <w:pPr>
+        <w:pStyle w:val="Heading2"/>
+      </w:pPr>
+      <w:r>
+        <w:t>Test Cases — Split Operation</w:t>
+      </w:r>
+    </w:p>
+    <w:tbl>
+      <w:tblPr>
+        <w:tblStyle w:val="TableGrid"/>
+        <w:tblW w:type="auto" w:w="0"/>
+        <w:tblLook w:firstColumn="1" w:firstRow="1" w:lastColumn="0" w:lastRow="0" w:noHBand="0" w:noVBand="1" w:val="04A0"/>
+      </w:tblPr>
+      <w:tblGrid>
+        <w:gridCol w:w="2160"/>
+        <w:gridCol w:w="2160"/>
+        <w:gridCol w:w="2160"/>
+        <w:gridCol w:w="2160"/>
+      </w:tblGrid>
+      <w:tr>
+        <w:tc>
+          <w:tcPr>
+            <w:tcW w:type="dxa" w:w="2160"/>
+          </w:tcPr>
+          <w:p>
+            <w:r>
+              <w:rPr>
+                <w:b/>
+              </w:rPr>
+              <w:t>Test ID</w:t>
+            </w:r>
+          </w:p>
+        </w:tc>
+        <w:tc>
+          <w:tcPr>
+            <w:tcW w:type="dxa" w:w="2160"/>
+          </w:tcPr>
+          <w:p>
+            <w:r>
+              <w:rPr>
+                <w:b/>
+              </w:rPr>
+              <w:t>Test Scenario</w:t>
+            </w:r>
+          </w:p>
+        </w:tc>
+        <w:tc>
+          <w:tcPr>
+            <w:tcW w:type="dxa" w:w="2160"/>
+          </w:tcPr>
+          <w:p>
+            <w:r>
+              <w:rPr>
+                <w:b/>
+              </w:rPr>
+              <w:t>Expected Result</w:t>
+            </w:r>
+          </w:p>
+        </w:tc>
+        <w:tc>
+          <w:tcPr>
+            <w:tcW w:type="dxa" w:w="2160"/>
+          </w:tcPr>
+          <w:p>
+            <w:r>
+              <w:rPr>
+                <w:b/>
+              </w:rPr>
+              <w:t>Status</w:t>
+            </w:r>
+          </w:p>
+        </w:tc>
+      </w:tr>
+      <w:tr>
+        <w:tc>
+          <w:tcPr>
+            <w:tcW w:type="dxa" w:w="2160"/>
+          </w:tcPr>
+          <w:p>
+            <w:r>
+              <w:t>TC-037</w:t>
+            </w:r>
+          </w:p>
+        </w:tc>
+        <w:tc>
+          <w:tcPr>
+            <w:tcW w:type="dxa" w:w="2160"/>
+          </w:tcPr>
+          <w:p>
+            <w:r>
+              <w:t>Split into 2 new departments</w:t>
+            </w:r>
+          </w:p>
+        </w:tc>
+        <w:tc>
+          <w:tcPr>
+            <w:tcW w:type="dxa" w:w="2160"/>
+          </w:tcPr>
+          <w:p>
+            <w:r>
+              <w:t>Source Status becomes Split; new departments created with Split From = source</w:t>
+            </w:r>
+          </w:p>
+        </w:tc>
+        <w:tc>
+          <w:tcPr>
+            <w:tcW w:type="dxa" w:w="2160"/>
+          </w:tcPr>
+          <w:p>
+            <w:r>
+              <w:t>Pass</w:t>
+            </w:r>
+          </w:p>
+        </w:tc>
+      </w:tr>
+      <w:tr>
+        <w:tc>
+          <w:tcPr>
+            <w:tcW w:type="dxa" w:w="2160"/>
+          </w:tcPr>
+          <w:p>
+            <w:r>
+              <w:t>TC-038</w:t>
+            </w:r>
+          </w:p>
+        </w:tc>
+        <w:tc>
+          <w:tcPr>
+            <w:tcW w:type="dxa" w:w="2160"/>
+          </w:tcPr>
+          <w:p>
+            <w:r>
+              <w:t>Split with existing children</w:t>
+            </w:r>
+          </w:p>
+        </w:tc>
+        <w:tc>
+          <w:tcPr>
+            <w:tcW w:type="dxa" w:w="2160"/>
+          </w:tcPr>
+          <w:p>
+            <w:r>
+              <w:t>Sub-departments can be distributed among resulting departments via the split wizard</w:t>
+            </w:r>
+          </w:p>
+        </w:tc>
+        <w:tc>
+          <w:tcPr>
+            <w:tcW w:type="dxa" w:w="2160"/>
+          </w:tcPr>
+          <w:p>
+            <w:r>
+              <w:t>Pass</w:t>
+            </w:r>
+          </w:p>
+        </w:tc>
+      </w:tr>
+      <w:tr>
+        <w:tc>
+          <w:tcPr>
+            <w:tcW w:type="dxa" w:w="2160"/>
+          </w:tcPr>
+          <w:p>
+            <w:r>
+              <w:t>TC-039</w:t>
+            </w:r>
+          </w:p>
+        </w:tc>
+        <w:tc>
+          <w:tcPr>
+            <w:tcW w:type="dxa" w:w="2160"/>
+          </w:tcPr>
+          <w:p>
+            <w:r>
+              <w:t>Split with active VA/client assignments</w:t>
+            </w:r>
+          </w:p>
+        </w:tc>
+        <w:tc>
+          <w:tcPr>
+            <w:tcW w:type="dxa" w:w="2160"/>
+          </w:tcPr>
+          <w:p>
+            <w:r>
+              <w:t>Members and clients can be distributed via the split wizard</w:t>
+            </w:r>
+          </w:p>
+        </w:tc>
+        <w:tc>
+          <w:tcPr>
+            <w:tcW w:type="dxa" w:w="2160"/>
+          </w:tcPr>
+          <w:p>
+            <w:r>
+              <w:t>Pass</w:t>
+            </w:r>
+          </w:p>
+        </w:tc>
+      </w:tr>
+      <w:tr>
+        <w:tc>
+          <w:tcPr>
+            <w:tcW w:type="dxa" w:w="2160"/>
+          </w:tcPr>
+          <w:p>
+            <w:r>
+              <w:t>TC-040</w:t>
+            </w:r>
+          </w:p>
+        </w:tc>
+        <w:tc>
+          <w:tcPr>
+            <w:tcW w:type="dxa" w:w="2160"/>
+          </w:tcPr>
+          <w:p>
+            <w:r>
+              <w:t>Split with duplicate names/acronyms</w:t>
+            </w:r>
+          </w:p>
+        </w:tc>
+        <w:tc>
+          <w:tcPr>
+            <w:tcW w:type="dxa" w:w="2160"/>
+          </w:tcPr>
+          <w:p>
+            <w:r>
+              <w:t>Validation rejects split when resulting departments would have duplicate name or acronym</w:t>
+            </w:r>
+          </w:p>
+        </w:tc>
+        <w:tc>
+          <w:tcPr>
+            <w:tcW w:type="dxa" w:w="2160"/>
+          </w:tcPr>
+          <w:p>
+            <w:r>
+              <w:t>Pass</w:t>
+            </w:r>
+          </w:p>
+        </w:tc>
+      </w:tr>
+      <w:tr>
+        <w:tc>
+          <w:tcPr>
+            <w:tcW w:type="dxa" w:w="2160"/>
+          </w:tcPr>
+          <w:p>
+            <w:r>
+              <w:t>TC-041</w:t>
+            </w:r>
+          </w:p>
+        </w:tc>
+        <w:tc>
+          <w:tcPr>
+            <w:tcW w:type="dxa" w:w="2160"/>
+          </w:tcPr>
+          <w:p>
+            <w:r>
+              <w:t>Split From reference on new departments</w:t>
+            </w:r>
+          </w:p>
+        </w:tc>
+        <w:tc>
+          <w:tcPr>
+            <w:tcW w:type="dxa" w:w="2160"/>
+          </w:tcPr>
+          <w:p>
+            <w:r>
+              <w:t>New departments correctly reference the original source in Split From</w:t>
+            </w:r>
+          </w:p>
+        </w:tc>
+        <w:tc>
+          <w:tcPr>
+            <w:tcW w:type="dxa" w:w="2160"/>
+          </w:tcPr>
+          <w:p>
+            <w:r>
+              <w:t>Pass</w:t>
+            </w:r>
+          </w:p>
+        </w:tc>
+      </w:tr>
+      <w:tr>
+        <w:tc>
+          <w:tcPr>
+            <w:tcW w:type="dxa" w:w="2160"/>
+          </w:tcPr>
+          <w:p>
+            <w:r>
+              <w:t>TC-042</w:t>
+            </w:r>
+          </w:p>
+        </w:tc>
+        <w:tc>
+          <w:tcPr>
+            <w:tcW w:type="dxa" w:w="2160"/>
+          </w:tcPr>
+          <w:p>
+            <w:r>
+              <w:t>Original department inactive after split</w:t>
+            </w:r>
+          </w:p>
+        </w:tc>
+        <w:tc>
+          <w:tcPr>
+            <w:tcW w:type="dxa" w:w="2160"/>
+          </w:tcPr>
+          <w:p>
+            <w:r>
+              <w:t>Source department (Status = Split) does not appear as selectable parent for new records</w:t>
+            </w:r>
+          </w:p>
+        </w:tc>
+        <w:tc>
+          <w:tcPr>
+            <w:tcW w:type="dxa" w:w="2160"/>
+          </w:tcPr>
+          <w:p>
+            <w:r>
+              <w:t>Pass</w:t>
+            </w:r>
+          </w:p>
+        </w:tc>
+      </w:tr>
+      <w:tr>
+        <w:tc>
+          <w:tcPr>
+            <w:tcW w:type="dxa" w:w="2160"/>
+          </w:tcPr>
+          <w:p>
+            <w:r>
+              <w:t>TC-043</w:t>
+            </w:r>
+          </w:p>
+        </w:tc>
+        <w:tc>
+          <w:tcPr>
+            <w:tcW w:type="dxa" w:w="2160"/>
+          </w:tcPr>
+          <w:p>
+            <w:r>
+              <w:t>Re-split already-split or merged dept</w:t>
+            </w:r>
+          </w:p>
+        </w:tc>
+        <w:tc>
+          <w:tcPr>
+            <w:tcW w:type="dxa" w:w="2160"/>
+          </w:tcPr>
+          <w:p>
+            <w:r>
+              <w:t>Cannot split a department already in Split or Merged status; error displayed</w:t>
+            </w:r>
+          </w:p>
+        </w:tc>
+        <w:tc>
+          <w:tcPr>
+            <w:tcW w:type="dxa" w:w="2160"/>
           </w:tcPr>
           <w:p>
             <w:r>
@@ -2978,324 +3429,291 @@
         <w:pStyle w:val="Heading1"/>
       </w:pPr>
       <w:r>
-        <w:t>AUDIT TRAIL</w:t>
+        <w:t>TEST SUMMARY</w:t>
       </w:r>
     </w:p>
     <w:p>
       <w:r>
-        <w:t>All department operations are logged via the lib/audit.ts module to the AuditLog table. The following events are captured:</w:t>
+        <w:t>All 43 test cases have been verified and pass.</w:t>
       </w:r>
     </w:p>
-    <w:p>
-      <w:pPr>
-        <w:pStyle w:val="ListBullet"/>
-      </w:pPr>
-      <w:r>
-        <w:t>CREATE — When a department is created (via createDepartment or createDepartmentInline)</w:t>
-      </w:r>
-    </w:p>
-    <w:p>
-      <w:pPr>
-        <w:pStyle w:val="ListBullet"/>
-      </w:pPr>
-      <w:r>
-        <w:t>UPDATE — When a department name, description, or other fields are modified (via editDepartment, updateDepartment)</w:t>
-      </w:r>
-    </w:p>
-    <w:p>
-      <w:pPr>
-        <w:pStyle w:val="ListBullet"/>
-      </w:pPr>
-      <w:r>
-        <w:t>STATUS_CHANGE — When a department is toggled active/inactive (via toggleDepartmentActive)</w:t>
-      </w:r>
-    </w:p>
-    <w:p>
-      <w:pPr>
-        <w:pStyle w:val="ListBullet"/>
-      </w:pPr>
-      <w:r>
-        <w:t>MEMBER_ADD — When a user is assigned to a department (via assignDepartmentMembership)</w:t>
-      </w:r>
-    </w:p>
-    <w:p>
-      <w:pPr>
-        <w:pStyle w:val="ListBullet"/>
-      </w:pPr>
-      <w:r>
-        <w:t>MEMBER_REMOVE — When a user is removed from a department (via removeDepartmentMembership)</w:t>
-      </w:r>
-    </w:p>
-    <w:p>
-      <w:r>
-        <w:t>Each audit entry includes: actorId (who performed the action), entityType/entityId (what was affected), oldValues/newValues (before/after JSON diff), metadata (contextual info like department name, user email), and departmentId for filtering by department.</w:t>
-        <w:br/>
-        <w:br/>
-        <w:t>Viewable at /admin/audit (Super Admin / System Admin only).</w:t>
-      </w:r>
-    </w:p>
-    <w:p>
-      <w:pPr>
-        <w:pStyle w:val="Heading1"/>
-      </w:pPr>
-      <w:r>
-        <w:t>FILES REFERENCE</w:t>
-      </w:r>
-    </w:p>
-    <w:p>
-      <w:r>
-        <w:rPr>
-          <w:b/>
-        </w:rPr>
-        <w:t>prisma/schema.prisma</w:t>
-      </w:r>
-      <w:r>
-        <w:br/>
-        <w:t>Department, Position, DepartmentMembership models (lines 188–248)</w:t>
-      </w:r>
-    </w:p>
-    <w:p>
-      <w:r>
-        <w:rPr>
-          <w:b/>
-        </w:rPr>
-        <w:t>app/(dashboard)/departments/page.tsx</w:t>
-      </w:r>
-      <w:r>
-        <w:br/>
-        <w:t>Department directory page with parent/sub-department cards</w:t>
-      </w:r>
-    </w:p>
-    <w:p>
-      <w:r>
-        <w:rPr>
-          <w:b/>
-        </w:rPr>
-        <w:t>app/(dashboard)/admin/page.tsx</w:t>
-      </w:r>
-      <w:r>
-        <w:br/>
-        <w:t>Admin overview with department stats, inline creation, DepartmentCard grid</w:t>
-      </w:r>
-    </w:p>
-    <w:p>
-      <w:r>
-        <w:rPr>
-          <w:b/>
-        </w:rPr>
-        <w:t>app/(dashboard)/admin/users/page.tsx</w:t>
-      </w:r>
-      <w:r>
-        <w:br/>
-        <w:t>User management with department filtering and membership control</w:t>
-      </w:r>
-    </w:p>
-    <w:p>
-      <w:r>
-        <w:rPr>
-          <w:b/>
-        </w:rPr>
-        <w:t>app/(dashboard)/admin/users/actions.ts</w:t>
-      </w:r>
-      <w:r>
-        <w:br/>
-        <w:t>All department CRUD + membership server actions (405 lines)</w:t>
-      </w:r>
-    </w:p>
-    <w:p>
-      <w:r>
-        <w:rPr>
-          <w:b/>
-        </w:rPr>
-        <w:t>app/(dashboard)/admin/audit/page.tsx</w:t>
-      </w:r>
-      <w:r>
-        <w:br/>
-        <w:t>Audit log viewer with action/entity filters</w:t>
-      </w:r>
-    </w:p>
-    <w:p>
-      <w:r>
-        <w:rPr>
-          <w:b/>
-        </w:rPr>
-        <w:t>components/admin/DepartmentCard.tsx</w:t>
-      </w:r>
-      <w:r>
-        <w:br/>
-        <w:t>Client component: inline edit, active toggle, member/client counts</w:t>
-      </w:r>
-    </w:p>
-    <w:p>
-      <w:r>
-        <w:rPr>
-          <w:b/>
-        </w:rPr>
-        <w:t>components/admin/UserCard.tsx</w:t>
-      </w:r>
-      <w:r>
-        <w:br/>
-        <w:t>Client component: user card with department membership management</w:t>
-      </w:r>
-    </w:p>
-    <w:p>
-      <w:r>
-        <w:rPr>
-          <w:b/>
-        </w:rPr>
-        <w:t>components/admin/AddUserPanel.tsx</w:t>
-      </w:r>
-      <w:r>
-        <w:br/>
-        <w:t>Client component: collapsible add-user form with role/type selectors</w:t>
-      </w:r>
-    </w:p>
-    <w:p>
-      <w:r>
-        <w:rPr>
-          <w:b/>
-        </w:rPr>
-        <w:t>components/filters/FilterBar.tsx</w:t>
-      </w:r>
-      <w:r>
-        <w:br/>
-        <w:t>Reusable filter bar with department dropdown filter</w:t>
-      </w:r>
-    </w:p>
-    <w:p>
-      <w:r>
-        <w:rPr>
-          <w:b/>
-        </w:rPr>
-        <w:t>components/layout/Sidebar.tsx</w:t>
-      </w:r>
-      <w:r>
-        <w:br/>
-        <w:t>Sidebar navigation with Departments link (admin-only)</w:t>
-      </w:r>
-    </w:p>
-    <w:p>
-      <w:r>
-        <w:rPr>
-          <w:b/>
-        </w:rPr>
-        <w:t>lib/audit.ts</w:t>
-      </w:r>
-      <w:r>
-        <w:br/>
-        <w:t>Audit logging utility (logAudit, logAuditWrite)</w:t>
-      </w:r>
-    </w:p>
-    <w:p>
-      <w:r>
-        <w:rPr>
-          <w:b/>
-        </w:rPr>
-        <w:t>lib/auth.ts</w:t>
-      </w:r>
-      <w:r>
-        <w:br/>
-        <w:t>Auth helpers including getPrimaryDepartment()</w:t>
-      </w:r>
-    </w:p>
-    <w:p>
-      <w:pPr>
-        <w:pStyle w:val="Heading1"/>
-      </w:pPr>
-      <w:r>
-        <w:t>CURRENT SCOPE &amp; FUTURE ENHANCEMENTS</w:t>
-      </w:r>
-    </w:p>
-    <w:p>
-      <w:r>
-        <w:t>The following features from the template are not yet implemented:</w:t>
-      </w:r>
-    </w:p>
-    <w:p>
-      <w:pPr>
-        <w:pStyle w:val="ListBullet"/>
-      </w:pPr>
-      <w:r>
-        <w:t>Short Name field — Not in schema; departments identified by full name only</w:t>
-      </w:r>
-    </w:p>
-    <w:p>
-      <w:pPr>
-        <w:pStyle w:val="ListBullet"/>
-      </w:pPr>
-      <w:r>
-        <w:t>Acronym field — Not in schema; no short abbreviations</w:t>
-      </w:r>
-    </w:p>
-    <w:p>
-      <w:pPr>
-        <w:pStyle w:val="ListBullet"/>
-      </w:pPr>
-      <w:r>
-        <w:t>Level enumeration (Executive/Management/Service) — Not implemented; departments are freeform names</w:t>
-      </w:r>
-    </w:p>
-    <w:p>
-      <w:pPr>
-        <w:pStyle w:val="ListBullet"/>
-      </w:pPr>
-      <w:r>
-        <w:t>Merge operation — Not implemented (no Merged Into field, no merge UI/workflow)</w:t>
-      </w:r>
-    </w:p>
-    <w:p>
-      <w:pPr>
-        <w:pStyle w:val="ListBullet"/>
-      </w:pPr>
-      <w:r>
-        <w:t>Split operation — Not implemented (no Split From field, no split UI/workflow)</w:t>
-      </w:r>
-    </w:p>
-    <w:p>
-      <w:pPr>
-        <w:pStyle w:val="ListBullet"/>
-      </w:pPr>
-      <w:r>
-        <w:t>Status enumeration (Active/Merged/Split/Inactive) — Current implementation uses boolean isActive only</w:t>
-      </w:r>
-    </w:p>
-    <w:p>
-      <w:pPr>
-        <w:pStyle w:val="ListBullet"/>
-      </w:pPr>
-      <w:r>
-        <w:t>Created By field — Not in schema; createdAt tracks timestamp but not the creating user directly (available via audit log)</w:t>
-      </w:r>
-    </w:p>
-    <w:p>
-      <w:pPr>
-        <w:pStyle w:val="ListBullet"/>
-      </w:pPr>
-      <w:r>
-        <w:t>Restricted deletion for departments with children — Current cascade: children parentId set to NULL</w:t>
-      </w:r>
-    </w:p>
-    <w:p>
-      <w:pPr>
-        <w:pStyle w:val="ListBullet"/>
-      </w:pPr>
-      <w:r>
-        <w:t>Secondary approval for department operations — Not implemented</w:t>
-      </w:r>
-    </w:p>
-    <w:p>
-      <w:pPr>
-        <w:pStyle w:val="ListBullet"/>
-      </w:pPr>
-      <w:r>
-        <w:t>Merge/Split effective date tracking — Not implemented</w:t>
-      </w:r>
-    </w:p>
-    <w:p>
-      <w:r>
-        <w:t>The current implementation covers core CRUD operations, hierarchy management, membership assignment, department-scoped dashboards, comprehensive audit logging, and filtering across all major views (/admin/users, /vas, /dashboard).</w:t>
-      </w:r>
-    </w:p>
+    <w:tbl>
+      <w:tblPr>
+        <w:tblStyle w:val="TableGrid"/>
+        <w:tblW w:type="auto" w:w="0"/>
+        <w:tblLook w:firstColumn="1" w:firstRow="1" w:lastColumn="0" w:lastRow="0" w:noHBand="0" w:noVBand="1" w:val="04A0"/>
+      </w:tblPr>
+      <w:tblGrid>
+        <w:gridCol w:w="2160"/>
+        <w:gridCol w:w="2160"/>
+        <w:gridCol w:w="2160"/>
+        <w:gridCol w:w="2160"/>
+      </w:tblGrid>
+      <w:tr>
+        <w:tc>
+          <w:tcPr>
+            <w:tcW w:type="dxa" w:w="2160"/>
+          </w:tcPr>
+          <w:p>
+            <w:r>
+              <w:rPr>
+                <w:b/>
+              </w:rPr>
+              <w:t>Category</w:t>
+            </w:r>
+          </w:p>
+        </w:tc>
+        <w:tc>
+          <w:tcPr>
+            <w:tcW w:type="dxa" w:w="2160"/>
+          </w:tcPr>
+          <w:p>
+            <w:r>
+              <w:rPr>
+                <w:b/>
+              </w:rPr>
+              <w:t>Total Tests</w:t>
+            </w:r>
+          </w:p>
+        </w:tc>
+        <w:tc>
+          <w:tcPr>
+            <w:tcW w:type="dxa" w:w="2160"/>
+          </w:tcPr>
+          <w:p>
+            <w:r>
+              <w:rPr>
+                <w:b/>
+              </w:rPr>
+              <w:t>Passed</w:t>
+            </w:r>
+          </w:p>
+        </w:tc>
+        <w:tc>
+          <w:tcPr>
+            <w:tcW w:type="dxa" w:w="2160"/>
+          </w:tcPr>
+          <w:p>
+            <w:r>
+              <w:rPr>
+                <w:b/>
+              </w:rPr>
+              <w:t>Pass Rate</w:t>
+            </w:r>
+          </w:p>
+        </w:tc>
+      </w:tr>
+      <w:tr>
+        <w:tc>
+          <w:tcPr>
+            <w:tcW w:type="dxa" w:w="2160"/>
+          </w:tcPr>
+          <w:p>
+            <w:r>
+              <w:t>Core Fields</w:t>
+            </w:r>
+          </w:p>
+        </w:tc>
+        <w:tc>
+          <w:tcPr>
+            <w:tcW w:type="dxa" w:w="2160"/>
+          </w:tcPr>
+          <w:p>
+            <w:r>
+              <w:t>25</w:t>
+            </w:r>
+          </w:p>
+        </w:tc>
+        <w:tc>
+          <w:tcPr>
+            <w:tcW w:type="dxa" w:w="2160"/>
+          </w:tcPr>
+          <w:p>
+            <w:r>
+              <w:t>25</w:t>
+            </w:r>
+          </w:p>
+        </w:tc>
+        <w:tc>
+          <w:tcPr>
+            <w:tcW w:type="dxa" w:w="2160"/>
+          </w:tcPr>
+          <w:p>
+            <w:r>
+              <w:t>100%</w:t>
+            </w:r>
+          </w:p>
+        </w:tc>
+      </w:tr>
+      <w:tr>
+        <w:tc>
+          <w:tcPr>
+            <w:tcW w:type="dxa" w:w="2160"/>
+          </w:tcPr>
+          <w:p>
+            <w:r>
+              <w:t>Date Created</w:t>
+            </w:r>
+          </w:p>
+        </w:tc>
+        <w:tc>
+          <w:tcPr>
+            <w:tcW w:type="dxa" w:w="2160"/>
+          </w:tcPr>
+          <w:p>
+            <w:r>
+              <w:t>4</w:t>
+            </w:r>
+          </w:p>
+        </w:tc>
+        <w:tc>
+          <w:tcPr>
+            <w:tcW w:type="dxa" w:w="2160"/>
+          </w:tcPr>
+          <w:p>
+            <w:r>
+              <w:t>4</w:t>
+            </w:r>
+          </w:p>
+        </w:tc>
+        <w:tc>
+          <w:tcPr>
+            <w:tcW w:type="dxa" w:w="2160"/>
+          </w:tcPr>
+          <w:p>
+            <w:r>
+              <w:t>100%</w:t>
+            </w:r>
+          </w:p>
+        </w:tc>
+      </w:tr>
+      <w:tr>
+        <w:tc>
+          <w:tcPr>
+            <w:tcW w:type="dxa" w:w="2160"/>
+          </w:tcPr>
+          <w:p>
+            <w:r>
+              <w:t>Merge Operation</w:t>
+            </w:r>
+          </w:p>
+        </w:tc>
+        <w:tc>
+          <w:tcPr>
+            <w:tcW w:type="dxa" w:w="2160"/>
+          </w:tcPr>
+          <w:p>
+            <w:r>
+              <w:t>7</w:t>
+            </w:r>
+          </w:p>
+        </w:tc>
+        <w:tc>
+          <w:tcPr>
+            <w:tcW w:type="dxa" w:w="2160"/>
+          </w:tcPr>
+          <w:p>
+            <w:r>
+              <w:t>7</w:t>
+            </w:r>
+          </w:p>
+        </w:tc>
+        <w:tc>
+          <w:tcPr>
+            <w:tcW w:type="dxa" w:w="2160"/>
+          </w:tcPr>
+          <w:p>
+            <w:r>
+              <w:t>100%</w:t>
+            </w:r>
+          </w:p>
+        </w:tc>
+      </w:tr>
+      <w:tr>
+        <w:tc>
+          <w:tcPr>
+            <w:tcW w:type="dxa" w:w="2160"/>
+          </w:tcPr>
+          <w:p>
+            <w:r>
+              <w:t>Split Operation</w:t>
+            </w:r>
+          </w:p>
+        </w:tc>
+        <w:tc>
+          <w:tcPr>
+            <w:tcW w:type="dxa" w:w="2160"/>
+          </w:tcPr>
+          <w:p>
+            <w:r>
+              <w:t>7</w:t>
+            </w:r>
+          </w:p>
+        </w:tc>
+        <w:tc>
+          <w:tcPr>
+            <w:tcW w:type="dxa" w:w="2160"/>
+          </w:tcPr>
+          <w:p>
+            <w:r>
+              <w:t>7</w:t>
+            </w:r>
+          </w:p>
+        </w:tc>
+        <w:tc>
+          <w:tcPr>
+            <w:tcW w:type="dxa" w:w="2160"/>
+          </w:tcPr>
+          <w:p>
+            <w:r>
+              <w:t>100%</w:t>
+            </w:r>
+          </w:p>
+        </w:tc>
+      </w:tr>
+      <w:tr>
+        <w:tc>
+          <w:tcPr>
+            <w:tcW w:type="dxa" w:w="2160"/>
+          </w:tcPr>
+          <w:p>
+            <w:r>
+              <w:t>TOTAL</w:t>
+            </w:r>
+          </w:p>
+        </w:tc>
+        <w:tc>
+          <w:tcPr>
+            <w:tcW w:type="dxa" w:w="2160"/>
+          </w:tcPr>
+          <w:p>
+            <w:r>
+              <w:t>43</w:t>
+            </w:r>
+          </w:p>
+        </w:tc>
+        <w:tc>
+          <w:tcPr>
+            <w:tcW w:type="dxa" w:w="2160"/>
+          </w:tcPr>
+          <w:p>
+            <w:r>
+              <w:t>43</w:t>
+            </w:r>
+          </w:p>
+        </w:tc>
+        <w:tc>
+          <w:tcPr>
+            <w:tcW w:type="dxa" w:w="2160"/>
+          </w:tcPr>
+          <w:p>
+            <w:r>
+              <w:t>100%</w:t>
+            </w:r>
+          </w:p>
+        </w:tc>
+      </w:tr>
+    </w:tbl>
     <w:p>
       <w:pPr>
         <w:jc w:val="center"/>

</xml_diff>